<commit_message>
DSS4: back-up ranking child and top-of-search targeting on every exact campaign
Each ranking campaign loads a back-up child's product ad paused, with a
switch rule at under 14 days of stock on the preferred child (back at 30),
and the projected switch dates and back-up coverage. Every enabled exact
campaign now targets top-of-search clicks (900% / 0% / 0%) unless its own
data shows top of search converting significantly worse. 39 cross-checks pass.

Co-Authored-By: Claude Opus 5.5 <noreply@anthropic.com>
Claude-Session: https://claude.ai/code/session_01LY7A1KPDoE1cQtWdmceR2R
</commit_message>
<xml_diff>
--- a/docs/DSS4_Audit_Review_20260929.docx
+++ b/docs/DSS4_Audit_Review_20260929.docx
@@ -61,7 +61,7 @@
         <w:spacing w:after="80"/>
       </w:pPr>
       <w:r>
-        <w:t xml:space="preserve">The audit's cuts toward break-even are not followed on ranking terms. Almost all of this product's advertising runs above break-even (break-even is only 17.7% for Queen Black). A rule of "cut to break-even" would therefore cut the campaigns that hold our rank. Of the audit's 79 price, modifier and budget cuts, 21 are on ranking terms: 17 are rejected and replaced by the top-of-search structure. Of the 58 on other terms, 37 become one −15% step with a rank guard, not a 50% cut. The other 20 are not made: Twin is on hold, the campaign is paused, or there are too few orders to judge.</w:t>
+        <w:t xml:space="preserve">The audit's cuts toward break-even are not followed on ranking terms. Almost all of this product's advertising runs above break-even (break-even is only 17.7% for Queen Black). A rule of "cut to break-even" would therefore cut the campaigns that hold our rank. Of the audit's 79 price, modifier and budget cuts, 21 are on ranking terms: 17 are rejected and replaced by the top-of-search structure. Of the 58 on other terms, 9 become one −15% step with a rank guard, not a 50% cut. The other 49 are not made: Twin is on hold, the campaign is paused, or there are too few orders to judge.</w:t>
       </w:r>
     </w:p>
     <w:p>
@@ -100,7 +100,7 @@
         <w:spacing w:after="80"/>
       </w:pPr>
       <w:r>
-        <w:t xml:space="preserve">Spend share: today ranking campaigns take 46% of spend and 30% of clicks. After the plan they take 64% of all spend, or 79% once the LTSF clearance and brand-defence budgets are ring-fenced. Reaching 80% of all spend would need non-ranking cut to $141/day, about 60% below plan. That would stop the LTSF clearance, so it is set out as an owner decision rather than done automatically.</w:t>
+        <w:t xml:space="preserve">Spend share: today ranking campaigns take 46% of spend and 30% of clicks. After the plan they take 67% of all spend, or 83% once the LTSF clearance and brand-defence budgets are ring-fenced. Reaching 80% of all spend would need non-ranking cut to $141/day, about 60% below plan. That would stop the LTSF clearance, so it is set out as an owner decision rather than done automatically.</w:t>
       </w:r>
     </w:p>
     <w:p>
@@ -113,7 +113,7 @@
         <w:spacing w:after="80"/>
       </w:pPr>
       <w:r>
-        <w:t xml:space="preserve">Top of search: 56 ranking campaigns go top-of-search only: a 900% modifier, the base bid at one tenth of today's top-of-search price, and rest of search and product pages at 0%. This is done only where the campaign's own 90-day placement data shows top of search converting at least as well; the 8 where it does not keep the other placements.</w:t>
+        <w:t xml:space="preserve">Top of search, for every exact campaign: 64 ranking campaigns and 226 other exact campaigns go top-of-search only: a 900% modifier, the base bid at one tenth of the top-of-search price, and rest of search and product pages at 0%. The only exception would be a campaign whose own data shows top of search converting significantly worse; none does.</w:t>
       </w:r>
     </w:p>
     <w:p>
@@ -126,7 +126,7 @@
         <w:spacing w:after="80"/>
       </w:pPr>
       <w:r>
-        <w:t xml:space="preserve">Stock is the binding constraint. At today's pace with last year's Q4 lift, Queen Black runs out around 2026-11-26 and Full Black around 2026-11-13, with nothing inbound. Under the plan: Queen 2026-11-26 (the same date, because non-ranking Queen traffic moves to Queen Grey and offsets the push) and Full 2026-11-05 (8 days earlier). The push only pays if they are restocked. To reach 31 Jan at the plan's pace: Queen Black needs about 2,774 units, Full Black 2,613 and Twin Black 342.</w:t>
+        <w:t xml:space="preserve">Back-up ranking child: every ranking campaign gets the back-up child's ad loaded PAUSED, and switches to it when the preferred child drops under 14 days of stock. The back-ups are Queen Grey then Stone Grey for Queen, King Red then King Grey for King, Full Grey for Full, and Twin Pink for Twin. At the plan's pace the Queen switch comes around 2026-11-14 and the Full switch around 2026-10-26.</w:t>
       </w:r>
     </w:p>
     <w:p>
@@ -139,7 +139,20 @@
         <w:spacing w:after="80"/>
       </w:pPr>
       <w:r>
-        <w:t xml:space="preserve">Money: the plan adds about $6,906 of ad spend a month and $12,151 of ad-attributed sales. Net profit on a 30-day basis goes from $3,853 to about $-351, before any organic gain from better rank. The push is an investment ahead of Q4, when last year's units ran ×1.866 (Nov) and ×2.488 (Dec) of September. The Push-cost tab lists every term so the owner can trim.</w:t>
+        <w:t xml:space="preserve">Stock is the binding constraint. At today's pace with last year's Q4 lift, Queen Black runs out around 2026-11-26 and Full Black around 2026-11-13, with nothing inbound. Under the plan: Queen 2026-11-27 (the same date, because non-ranking Queen traffic moves to Queen Grey and offsets the push) and Full 2026-11-05 (8 days earlier). The push only pays if they are restocked. To reach 31 Jan at the plan's pace: Queen Black needs about 2,692 units, Full Black 2,589 and Twin Black 313.</w:t>
+      </w:r>
+    </w:p>
+    <w:p>
+      <w:pPr>
+        <w:pStyle w:val="ListParagraph"/>
+        <w:numPr>
+          <w:ilvl w:val="0"/>
+          <w:numId w:val="2"/>
+        </w:numPr>
+        <w:spacing w:after="80"/>
+      </w:pPr>
+      <w:r>
+        <w:t xml:space="preserve">Money: the plan adds about $5,637 of ad spend a month and $8,628 of ad-attributed sales. Net profit on a 30-day basis goes from $3,853 to about $210, before any organic gain from better rank. The push is an investment ahead of Q4, when last year's units ran ×1.866 (Nov) and ×2.488 (Dec) of September. The Push-cost tab lists every term so the owner can trim.</w:t>
       </w:r>
     </w:p>
     <w:p>
@@ -9556,7 +9569,7 @@
         <w:spacing w:after="80"/>
       </w:pPr>
       <w:r>
-        <w:t xml:space="preserve">Our ads on it: one exact campaign (ID 520117564893402) advertising Queen Grey, with a $20/day budget 100% used and a 0.94% top-of-search impression share. It gets 7.13 paid clicks a day out of the market's 1,229. Paid conversion on the term is 11.1%. Top of search converts at 16.7% against 7.1% elsewhere (90 days).</w:t>
+        <w:t xml:space="preserve">Our ads on it: one exact campaign (ID 520117564893402) advertising Queen Grey, with a $20/day budget 100% used and a 0.94% top-of-search impression share. It gets 7.13 paid clicks a day out of the market's 1,229. Paid conversion on the term is 11.1%. Top of search converts at 16.7% against 7.1% on 28 elsewhere (90 days).</w:t>
       </w:r>
     </w:p>
     <w:p>
@@ -9582,7 +9595,7 @@
         <w:spacing w:after="80"/>
       </w:pPr>
       <w:r>
-        <w:t xml:space="preserve">Decision: push. Move the ad to Queen Black (a proven seller with the best profit per top-of-search click). Go top-of-search only: 900% modifier, base bid $0.23, top-of-search price $2.3. Set the budget to $44/day for 17.0 clicks a day (from 7.13). Target: rank 27 → ≤10. Cost over today: $27.85/day for +1.19 orders/day. Stock: Queen Black is covered to 2026-11-26 at the plan's pace, and the reorder decides whether the push continues past that date.</w:t>
+        <w:t xml:space="preserve">Decision: push. Move the ad to Queen Black (a proven seller with the best profit per top-of-search click). Go top-of-search only: 900% modifier, base bid $0.23, top-of-search price $2.3. Set the budget to $44/day for 17.0 clicks a day (from 7.13). Target: rank 27 → ≤10. Cost over today: $27.85/day for +1.19 orders/day. Stock: Queen Black is covered to 2026-11-27 at the plan's pace, and the reorder decides whether the push continues past that date.</w:t>
       </w:r>
     </w:p>
     <w:p>
@@ -9599,7 +9612,7 @@
         <w:spacing w:after="120"/>
       </w:pPr>
       <w:r>
-        <w:t xml:space="preserve">Every non-cosmetic decision in the audit (381; renames and retags excluded) was re-judged. For each one we checked the campaign's objective, how much of our paid traffic on the term it carries, the term's rank and its trend, the effect on clicks, orders, sales, spend and profit, the TACoS change, the advertised child's stock and LTSF status, and who ranks around us. Verdicts: REJECT 230; MODIFY 100; ACCEPT 37; REVIEW 14. The verdict is read from the final action on each campaign, so the review, the campaign tab and this document agree.</w:t>
+        <w:t xml:space="preserve">Every non-cosmetic decision in the audit (381; renames and retags excluded) was re-judged. For each one we checked the campaign's objective, how much of our paid traffic on the term it carries, the term's rank and its trend, the effect on clicks, orders, sales, spend and profit, the TACoS change, the advertised child's stock and LTSF status, and who ranks around us. Verdicts: REJECT 249; MODIFY 77; ACCEPT 41; REVIEW 14. The verdict is read from the final action on each campaign, so the review, the campaign tab and this document agree.</w:t>
       </w:r>
     </w:p>
     <w:p>
@@ -11569,7 +11582,7 @@
                 <w:sz w:val="16"/>
                 <w:szCs w:val="16"/>
               </w:rPr>
-              <w:t xml:space="preserve">bid unchanged</w:t>
+              <w:t xml:space="preserve">base $0.35 with TOS 900% → top-of-search price $3.5</w:t>
             </w:r>
           </w:p>
         </w:tc>
@@ -11597,7 +11610,7 @@
                 <w:sz w:val="16"/>
                 <w:szCs w:val="16"/>
               </w:rPr>
-              <w:t xml:space="preserve">Not a ranking term; ACoS 81.2% vs break-even 31.3% on 13 orders in 30 days — trimming toward break-even is right / Effect: -0.76 clicks, -0.1 orders, $-2.86 sales, $-2.3 spend, $1.44 profit per day</w:t>
+              <w:t xml:space="preserve">Not a ranking term; ACoS 81.2% vs break-even 31.3% on 13 orders in 30 days — trimming toward break-even is right / Effect: -0.76 clicks, -0.1 orders, $-2.86 sales, $-2.3 spend, $1.44 profit per day / Replaced by the top-</w:t>
             </w:r>
           </w:p>
         </w:tc>
@@ -12060,7 +12073,7 @@
                 <w:sz w:val="16"/>
                 <w:szCs w:val="16"/>
               </w:rPr>
-              <w:t xml:space="preserve">MODIFY</w:t>
+              <w:t xml:space="preserve">REJECT</w:t>
             </w:r>
           </w:p>
         </w:tc>
@@ -12088,7 +12101,7 @@
                 <w:sz w:val="16"/>
                 <w:szCs w:val="16"/>
               </w:rPr>
-              <w:t xml:space="preserve">budget/modifier unchanged; all targets −15% (one step, re-read after 7 days, rank guard)</w:t>
+              <w:t xml:space="preserve">budget → $13.0</w:t>
             </w:r>
           </w:p>
         </w:tc>
@@ -12233,7 +12246,7 @@
                 <w:sz w:val="16"/>
                 <w:szCs w:val="16"/>
               </w:rPr>
-              <w:t xml:space="preserve">MODIFY</w:t>
+              <w:t xml:space="preserve">REJECT</w:t>
             </w:r>
           </w:p>
         </w:tc>
@@ -12261,7 +12274,7 @@
                 <w:sz w:val="16"/>
                 <w:szCs w:val="16"/>
               </w:rPr>
-              <w:t xml:space="preserve">all targets −15% (one step)</w:t>
+              <w:t xml:space="preserve">base $0.2 with TOS 900% → top-of-search price $2.0</w:t>
             </w:r>
           </w:p>
         </w:tc>
@@ -12289,7 +12302,7 @@
                 <w:sz w:val="16"/>
                 <w:szCs w:val="16"/>
               </w:rPr>
-              <w:t xml:space="preserve">Not a ranking term; ACoS 29.7% vs break-even 26.2% on 28 orders in 30 days — trimming toward break-even is right / Effect: -0.3 clicks, -0.05 orders, $-1.58 sales, $-0.47 spend, $0.04 profit per day</w:t>
+              <w:t xml:space="preserve">Not a ranking term; ACoS 29.7% vs break-even 26.2% on 28 orders in 30 days — trimming toward break-even is right / Effect: -0.3 clicks, -0.05 orders, $-1.58 sales, $-0.47 spend, $0.04 profit per day / Replaced by the top</w:t>
             </w:r>
           </w:p>
         </w:tc>
@@ -12322,7 +12335,7 @@
         <w:spacing w:after="120"/>
       </w:pPr>
       <w:r>
-        <w:t xml:space="preserve">Spend and click share. Today: ranking 46% of spend, 30% of clicks. Plan, week 1: 64% of spend ($563 of $878/day) and 46% of clicks. Discovery clicks are cheap, so click share trails spend share. With LTSF clearance and brand defence ring-fenced as their own objectives, ranking is 79% of the remaining keyword spend. Two more −15% steps on the steppable non-ranking campaigns, if their ranks hold, take that to about 82% by week 3. Reaching 80–90% of ALL spend needs non-ranking at $141–63/day. That would cut the LTSF clearance that is selling Queen Grey's aged stock, so it is left for the owner to decide.</w:t>
+        <w:t xml:space="preserve">Spend and click share. Today: ranking 46% of spend, 30% of clicks. Plan, week 1: 67% of spend ($563 of $835/day) and 49% of clicks. Discovery clicks are cheap, so click share trails spend share. With LTSF clearance and brand defence ring-fenced as their own objectives, ranking is 83% of the remaining keyword spend. Two more −15% steps on the steppable non-ranking campaigns, if their ranks hold, take that to about 84% by week 3. Reaching 80–90% of ALL spend needs non-ranking at $141–63/day. That would cut the LTSF clearance that is selling Queen Grey's aged stock, so it is left for the owner to decide.</w:t>
       </w:r>
     </w:p>
     <w:tbl>
@@ -12642,7 +12655,7 @@
                 <w:sz w:val="16"/>
                 <w:szCs w:val="16"/>
               </w:rPr>
-              <w:t xml:space="preserve">$80</w:t>
+              <w:t xml:space="preserve">$62</w:t>
             </w:r>
           </w:p>
         </w:tc>
@@ -12698,7 +12711,7 @@
                 <w:sz w:val="16"/>
                 <w:szCs w:val="16"/>
               </w:rPr>
-              <w:t xml:space="preserve">4.9</w:t>
+              <w:t xml:space="preserve">4.0</w:t>
             </w:r>
           </w:p>
         </w:tc>
@@ -12988,7 +13001,7 @@
                 <w:sz w:val="16"/>
                 <w:szCs w:val="16"/>
               </w:rPr>
-              <w:t xml:space="preserve">$32</w:t>
+              <w:t xml:space="preserve">$15</w:t>
             </w:r>
           </w:p>
         </w:tc>
@@ -13044,7 +13057,7 @@
                 <w:sz w:val="16"/>
                 <w:szCs w:val="16"/>
               </w:rPr>
-              <w:t xml:space="preserve">3.2</w:t>
+              <w:t xml:space="preserve">1.3</w:t>
             </w:r>
           </w:p>
         </w:tc>
@@ -13161,7 +13174,7 @@
                 <w:sz w:val="16"/>
                 <w:szCs w:val="16"/>
               </w:rPr>
-              <w:t xml:space="preserve">$3</w:t>
+              <w:t xml:space="preserve">$1</w:t>
             </w:r>
           </w:p>
         </w:tc>
@@ -13217,7 +13230,7 @@
                 <w:sz w:val="16"/>
                 <w:szCs w:val="16"/>
               </w:rPr>
-              <w:t xml:space="preserve">0.2</w:t>
+              <w:t xml:space="preserve">0.1</w:t>
             </w:r>
           </w:p>
         </w:tc>
@@ -14026,7 +14039,7 @@
                 <w:sz w:val="16"/>
                 <w:szCs w:val="16"/>
               </w:rPr>
-              <w:t xml:space="preserve">$22</w:t>
+              <w:t xml:space="preserve">$21</w:t>
             </w:r>
           </w:p>
         </w:tc>
@@ -14199,7 +14212,7 @@
                 <w:sz w:val="16"/>
                 <w:szCs w:val="16"/>
               </w:rPr>
-              <w:t xml:space="preserve">$26</w:t>
+              <w:t xml:space="preserve">$23</w:t>
             </w:r>
           </w:p>
         </w:tc>
@@ -14255,7 +14268,7 @@
                 <w:sz w:val="16"/>
                 <w:szCs w:val="16"/>
               </w:rPr>
-              <w:t xml:space="preserve">4.0</w:t>
+              <w:t xml:space="preserve">3.5</w:t>
             </w:r>
           </w:p>
         </w:tc>
@@ -14545,7 +14558,7 @@
                 <w:sz w:val="16"/>
                 <w:szCs w:val="16"/>
               </w:rPr>
-              <w:t xml:space="preserve">$5</w:t>
+              <w:t xml:space="preserve">$2</w:t>
             </w:r>
           </w:p>
         </w:tc>
@@ -14601,7 +14614,7 @@
                 <w:sz w:val="16"/>
                 <w:szCs w:val="16"/>
               </w:rPr>
-              <w:t xml:space="preserve">0.6</w:t>
+              <w:t xml:space="preserve">0.2</w:t>
             </w:r>
           </w:p>
         </w:tc>
@@ -14947,7 +14960,7 @@
                 <w:sz w:val="16"/>
                 <w:szCs w:val="16"/>
               </w:rPr>
-              <w:t xml:space="preserve">0.2</w:t>
+              <w:t xml:space="preserve">0.1</w:t>
             </w:r>
           </w:p>
         </w:tc>
@@ -14980,7 +14993,7 @@
         <w:spacing w:after="120"/>
       </w:pPr>
       <w:r>
-        <w:t xml:space="preserve">Checked per campaign before applying: top-of-search conversion (90 days) must be at least 90% of the conversion elsewhere. 56 ranking campaigns pass. 8 do not. They keep rest of search and product pages open, with top of search weighted at 100% or more. Examples: D-S4-satin bed sheets - [Satin] - Exact  — NOT supported: top-of-search CVR 10.0% vs 11.6% elsewhere on 50/43 clicks — keep rest-of-s; D-S4-silk queen sheets - [Silk|Queen] -  — NOT supported: top-of-search CVR 24.1% vs 42.9% elsewhere on 83/7 clicks — keep rest-of-se; D-S4-satin queen sheets - [Satin|Queen]  — NOT supported: top-of-search CVR 13.5% vs 19.0% elsewhere on 74/21 clicks — keep rest-of-s; D-S4-black silk sheets - [Silk] - Exact  — NOT supported: top-of-search CVR 15.7% vs 21.2% elsewhere on 178/80 clicks — keep rest-of-; D-S4-SP-queen sheet silk-(Silk)-LSV-Exac — NOT supported: to.</w:t>
+        <w:t xml:space="preserve">This applies to every exact campaign, not only ranking. 290 of the 326 enabled exact campaigns go top-of-search only. Ranking campaigns keep today's top-of-search price; other exact campaigns keep today's effective top-of-search bid, less the −15% step where one applies. The only exception is a campaign whose own 90-day data shows top of search converting significantly worse than the other placements (both at least 20 clicks, a 95% test). No campaign meets that exception. 36 enabled exact campaigns have no clicks in 90 days and no bid in any source, so they have nothing to price; set them the same way when they are next edited. Second-order effect: non-ranking exact campaigns lose their rest-of-search and product-page clicks. The plan counts only their top-of-search clicks, at top-of-search conversion, so their orders fall and their conversion rises.</w:t>
       </w:r>
     </w:p>
     <w:p>
@@ -15902,6 +15915,1280 @@
       <w:pPr>
         <w:spacing w:after="120"/>
       </w:pPr>
+    </w:p>
+    <w:p>
+      <w:pPr>
+        <w:pStyle w:val="Heading2"/>
+        <w:spacing w:after="80" w:before="200"/>
+      </w:pPr>
+      <w:r>
+        <w:t xml:space="preserve">Back-up ranking child — when the preferred child runs low or out</w:t>
+      </w:r>
+    </w:p>
+    <w:p>
+      <w:pPr>
+        <w:spacing w:after="120"/>
+      </w:pPr>
+      <w:r>
+        <w:t xml:space="preserve">Every ranking campaign now carries a back-up product ad, loaded PAUSED. When the preferred child drops under 14 days of stock or goes out of stock, the back-up ad is enabled and the preferred ad paused. The switch back happens once the preferred child has 30 days or more. Rule for the back-up: another child with positive profit per top-of-search click and at least 5% of the size's units. One with 60 or more days of stock at push pace can carry the push; one with 30–59 days carries the maintain level only.</w:t>
+      </w:r>
+    </w:p>
+    <w:tbl>
+      <w:tblPr>
+        <w:tblW w:type="dxa" w:w="9360"/>
+        <w:tblBorders>
+          <w:top w:val="single" w:color="auto" w:sz="4"/>
+          <w:left w:val="single" w:color="auto" w:sz="4"/>
+          <w:bottom w:val="single" w:color="auto" w:sz="4"/>
+          <w:right w:val="single" w:color="auto" w:sz="4"/>
+          <w:insideH w:val="single" w:color="auto" w:sz="4"/>
+          <w:insideV w:val="single" w:color="auto" w:sz="4"/>
+        </w:tblBorders>
+      </w:tblPr>
+      <w:tblGrid>
+        <w:gridCol w:w="1560"/>
+        <w:gridCol w:w="1560"/>
+        <w:gridCol w:w="1560"/>
+        <w:gridCol w:w="1560"/>
+        <w:gridCol w:w="1560"/>
+        <w:gridCol w:w="1560"/>
+      </w:tblGrid>
+      <w:tr>
+        <w:trPr>
+          <w:tblHeader/>
+        </w:trPr>
+        <w:tc>
+          <w:tcPr>
+            <w:tcW w:type="dxa" w:w="1560"/>
+            <w:tcBorders>
+              <w:top w:val="single" w:color="BFBFBF" w:sz="4"/>
+              <w:left w:val="single" w:color="BFBFBF" w:sz="4"/>
+              <w:bottom w:val="single" w:color="BFBFBF" w:sz="4"/>
+              <w:right w:val="single" w:color="BFBFBF" w:sz="4"/>
+            </w:tcBorders>
+            <w:shd w:fill="1F3864" w:color="auto" w:val="clear"/>
+            <w:tcMar>
+              <w:top w:type="dxa" w:w="40"/>
+              <w:left w:type="dxa" w:w="80"/>
+              <w:bottom w:type="dxa" w:w="40"/>
+              <w:right w:type="dxa" w:w="80"/>
+            </w:tcMar>
+          </w:tcPr>
+          <w:p>
+            <w:r>
+              <w:rPr>
+                <w:b/>
+                <w:bCs/>
+                <w:color w:val="FFFFFF"/>
+                <w:sz w:val="16"/>
+                <w:szCs w:val="16"/>
+              </w:rPr>
+              <w:t xml:space="preserve">Size</w:t>
+            </w:r>
+          </w:p>
+        </w:tc>
+        <w:tc>
+          <w:tcPr>
+            <w:tcW w:type="dxa" w:w="1560"/>
+            <w:tcBorders>
+              <w:top w:val="single" w:color="BFBFBF" w:sz="4"/>
+              <w:left w:val="single" w:color="BFBFBF" w:sz="4"/>
+              <w:bottom w:val="single" w:color="BFBFBF" w:sz="4"/>
+              <w:right w:val="single" w:color="BFBFBF" w:sz="4"/>
+            </w:tcBorders>
+            <w:shd w:fill="1F3864" w:color="auto" w:val="clear"/>
+            <w:tcMar>
+              <w:top w:type="dxa" w:w="40"/>
+              <w:left w:type="dxa" w:w="80"/>
+              <w:bottom w:type="dxa" w:w="40"/>
+              <w:right w:type="dxa" w:w="80"/>
+            </w:tcMar>
+          </w:tcPr>
+          <w:p>
+            <w:r>
+              <w:rPr>
+                <w:b/>
+                <w:bCs/>
+                <w:color w:val="FFFFFF"/>
+                <w:sz w:val="16"/>
+                <w:szCs w:val="16"/>
+              </w:rPr>
+              <w:t xml:space="preserve">Preferred</w:t>
+            </w:r>
+          </w:p>
+        </w:tc>
+        <w:tc>
+          <w:tcPr>
+            <w:tcW w:type="dxa" w:w="1560"/>
+            <w:tcBorders>
+              <w:top w:val="single" w:color="BFBFBF" w:sz="4"/>
+              <w:left w:val="single" w:color="BFBFBF" w:sz="4"/>
+              <w:bottom w:val="single" w:color="BFBFBF" w:sz="4"/>
+              <w:right w:val="single" w:color="BFBFBF" w:sz="4"/>
+            </w:tcBorders>
+            <w:shd w:fill="1F3864" w:color="auto" w:val="clear"/>
+            <w:tcMar>
+              <w:top w:type="dxa" w:w="40"/>
+              <w:left w:type="dxa" w:w="80"/>
+              <w:bottom w:type="dxa" w:w="40"/>
+              <w:right w:type="dxa" w:w="80"/>
+            </w:tcMar>
+          </w:tcPr>
+          <w:p>
+            <w:r>
+              <w:rPr>
+                <w:b/>
+                <w:bCs/>
+                <w:color w:val="FFFFFF"/>
+                <w:sz w:val="16"/>
+                <w:szCs w:val="16"/>
+              </w:rPr>
+              <w:t xml:space="preserve">Back-up #1 / #2</w:t>
+            </w:r>
+          </w:p>
+        </w:tc>
+        <w:tc>
+          <w:tcPr>
+            <w:tcW w:type="dxa" w:w="1560"/>
+            <w:tcBorders>
+              <w:top w:val="single" w:color="BFBFBF" w:sz="4"/>
+              <w:left w:val="single" w:color="BFBFBF" w:sz="4"/>
+              <w:bottom w:val="single" w:color="BFBFBF" w:sz="4"/>
+              <w:right w:val="single" w:color="BFBFBF" w:sz="4"/>
+            </w:tcBorders>
+            <w:shd w:fill="1F3864" w:color="auto" w:val="clear"/>
+            <w:tcMar>
+              <w:top w:type="dxa" w:w="40"/>
+              <w:left w:type="dxa" w:w="80"/>
+              <w:bottom w:type="dxa" w:w="40"/>
+              <w:right w:type="dxa" w:w="80"/>
+            </w:tcMar>
+          </w:tcPr>
+          <w:p>
+            <w:r>
+              <w:rPr>
+                <w:b/>
+                <w:bCs/>
+                <w:color w:val="FFFFFF"/>
+                <w:sz w:val="16"/>
+                <w:szCs w:val="16"/>
+              </w:rPr>
+              <w:t xml:space="preserve">Can carry</w:t>
+            </w:r>
+          </w:p>
+        </w:tc>
+        <w:tc>
+          <w:tcPr>
+            <w:tcW w:type="dxa" w:w="1560"/>
+            <w:tcBorders>
+              <w:top w:val="single" w:color="BFBFBF" w:sz="4"/>
+              <w:left w:val="single" w:color="BFBFBF" w:sz="4"/>
+              <w:bottom w:val="single" w:color="BFBFBF" w:sz="4"/>
+              <w:right w:val="single" w:color="BFBFBF" w:sz="4"/>
+            </w:tcBorders>
+            <w:shd w:fill="1F3864" w:color="auto" w:val="clear"/>
+            <w:tcMar>
+              <w:top w:type="dxa" w:w="40"/>
+              <w:left w:type="dxa" w:w="80"/>
+              <w:bottom w:type="dxa" w:w="40"/>
+              <w:right w:type="dxa" w:w="80"/>
+            </w:tcMar>
+          </w:tcPr>
+          <w:p>
+            <w:r>
+              <w:rPr>
+                <w:b/>
+                <w:bCs/>
+                <w:color w:val="FFFFFF"/>
+                <w:sz w:val="16"/>
+                <w:szCs w:val="16"/>
+              </w:rPr>
+              <w:t xml:space="preserve">Projected switch</w:t>
+            </w:r>
+          </w:p>
+        </w:tc>
+        <w:tc>
+          <w:tcPr>
+            <w:tcW w:type="dxa" w:w="1560"/>
+            <w:tcBorders>
+              <w:top w:val="single" w:color="BFBFBF" w:sz="4"/>
+              <w:left w:val="single" w:color="BFBFBF" w:sz="4"/>
+              <w:bottom w:val="single" w:color="BFBFBF" w:sz="4"/>
+              <w:right w:val="single" w:color="BFBFBF" w:sz="4"/>
+            </w:tcBorders>
+            <w:shd w:fill="1F3864" w:color="auto" w:val="clear"/>
+            <w:tcMar>
+              <w:top w:type="dxa" w:w="40"/>
+              <w:left w:type="dxa" w:w="80"/>
+              <w:bottom w:type="dxa" w:w="40"/>
+              <w:right w:type="dxa" w:w="80"/>
+            </w:tcMar>
+          </w:tcPr>
+          <w:p>
+            <w:r>
+              <w:rPr>
+                <w:b/>
+                <w:bCs/>
+                <w:color w:val="FFFFFF"/>
+                <w:sz w:val="16"/>
+                <w:szCs w:val="16"/>
+              </w:rPr>
+              <w:t xml:space="preserve">Back-up lasts to</w:t>
+            </w:r>
+          </w:p>
+        </w:tc>
+      </w:tr>
+      <w:tr>
+        <w:trPr>
+          <w:tblHeader w:val="off"/>
+        </w:trPr>
+        <w:tc>
+          <w:tcPr>
+            <w:tcW w:type="dxa" w:w="1560"/>
+            <w:tcBorders>
+              <w:top w:val="single" w:color="BFBFBF" w:sz="4"/>
+              <w:left w:val="single" w:color="BFBFBF" w:sz="4"/>
+              <w:bottom w:val="single" w:color="BFBFBF" w:sz="4"/>
+              <w:right w:val="single" w:color="BFBFBF" w:sz="4"/>
+            </w:tcBorders>
+            <w:tcMar>
+              <w:top w:type="dxa" w:w="40"/>
+              <w:left w:type="dxa" w:w="80"/>
+              <w:bottom w:type="dxa" w:w="40"/>
+              <w:right w:type="dxa" w:w="80"/>
+            </w:tcMar>
+          </w:tcPr>
+          <w:p>
+            <w:r>
+              <w:rPr>
+                <w:b w:val="false"/>
+                <w:bCs w:val="false"/>
+                <w:sz w:val="16"/>
+                <w:szCs w:val="16"/>
+              </w:rPr>
+              <w:t xml:space="preserve">Queen</w:t>
+            </w:r>
+          </w:p>
+        </w:tc>
+        <w:tc>
+          <w:tcPr>
+            <w:tcW w:type="dxa" w:w="1560"/>
+            <w:tcBorders>
+              <w:top w:val="single" w:color="BFBFBF" w:sz="4"/>
+              <w:left w:val="single" w:color="BFBFBF" w:sz="4"/>
+              <w:bottom w:val="single" w:color="BFBFBF" w:sz="4"/>
+              <w:right w:val="single" w:color="BFBFBF" w:sz="4"/>
+            </w:tcBorders>
+            <w:tcMar>
+              <w:top w:type="dxa" w:w="40"/>
+              <w:left w:type="dxa" w:w="80"/>
+              <w:bottom w:type="dxa" w:w="40"/>
+              <w:right w:type="dxa" w:w="80"/>
+            </w:tcMar>
+          </w:tcPr>
+          <w:p>
+            <w:r>
+              <w:rPr>
+                <w:b w:val="false"/>
+                <w:bCs w:val="false"/>
+                <w:sz w:val="16"/>
+                <w:szCs w:val="16"/>
+              </w:rPr>
+              <w:t xml:space="preserve">SATIN-QUEEN-BLACK</w:t>
+            </w:r>
+          </w:p>
+        </w:tc>
+        <w:tc>
+          <w:tcPr>
+            <w:tcW w:type="dxa" w:w="1560"/>
+            <w:tcBorders>
+              <w:top w:val="single" w:color="BFBFBF" w:sz="4"/>
+              <w:left w:val="single" w:color="BFBFBF" w:sz="4"/>
+              <w:bottom w:val="single" w:color="BFBFBF" w:sz="4"/>
+              <w:right w:val="single" w:color="BFBFBF" w:sz="4"/>
+            </w:tcBorders>
+            <w:tcMar>
+              <w:top w:type="dxa" w:w="40"/>
+              <w:left w:type="dxa" w:w="80"/>
+              <w:bottom w:type="dxa" w:w="40"/>
+              <w:right w:type="dxa" w:w="80"/>
+            </w:tcMar>
+          </w:tcPr>
+          <w:p>
+            <w:r>
+              <w:rPr>
+                <w:b w:val="false"/>
+                <w:bCs w:val="false"/>
+                <w:sz w:val="16"/>
+                <w:szCs w:val="16"/>
+              </w:rPr>
+              <w:t xml:space="preserve">#1 SATIN-QUEEN-GREY</w:t>
+            </w:r>
+          </w:p>
+        </w:tc>
+        <w:tc>
+          <w:tcPr>
+            <w:tcW w:type="dxa" w:w="1560"/>
+            <w:tcBorders>
+              <w:top w:val="single" w:color="BFBFBF" w:sz="4"/>
+              <w:left w:val="single" w:color="BFBFBF" w:sz="4"/>
+              <w:bottom w:val="single" w:color="BFBFBF" w:sz="4"/>
+              <w:right w:val="single" w:color="BFBFBF" w:sz="4"/>
+            </w:tcBorders>
+            <w:tcMar>
+              <w:top w:type="dxa" w:w="40"/>
+              <w:left w:type="dxa" w:w="80"/>
+              <w:bottom w:type="dxa" w:w="40"/>
+              <w:right w:type="dxa" w:w="80"/>
+            </w:tcMar>
+          </w:tcPr>
+          <w:p>
+            <w:r>
+              <w:rPr>
+                <w:b w:val="false"/>
+                <w:bCs w:val="false"/>
+                <w:sz w:val="16"/>
+                <w:szCs w:val="16"/>
+              </w:rPr>
+              <w:t xml:space="preserve">maintain only</w:t>
+            </w:r>
+          </w:p>
+        </w:tc>
+        <w:tc>
+          <w:tcPr>
+            <w:tcW w:type="dxa" w:w="1560"/>
+            <w:tcBorders>
+              <w:top w:val="single" w:color="BFBFBF" w:sz="4"/>
+              <w:left w:val="single" w:color="BFBFBF" w:sz="4"/>
+              <w:bottom w:val="single" w:color="BFBFBF" w:sz="4"/>
+              <w:right w:val="single" w:color="BFBFBF" w:sz="4"/>
+            </w:tcBorders>
+            <w:tcMar>
+              <w:top w:type="dxa" w:w="40"/>
+              <w:left w:type="dxa" w:w="80"/>
+              <w:bottom w:type="dxa" w:w="40"/>
+              <w:right w:type="dxa" w:w="80"/>
+            </w:tcMar>
+          </w:tcPr>
+          <w:p>
+            <w:r>
+              <w:rPr>
+                <w:b w:val="false"/>
+                <w:bCs w:val="false"/>
+                <w:sz w:val="16"/>
+                <w:szCs w:val="16"/>
+              </w:rPr>
+              <w:t xml:space="preserve">2026-11-14</w:t>
+            </w:r>
+          </w:p>
+        </w:tc>
+        <w:tc>
+          <w:tcPr>
+            <w:tcW w:type="dxa" w:w="1560"/>
+            <w:tcBorders>
+              <w:top w:val="single" w:color="BFBFBF" w:sz="4"/>
+              <w:left w:val="single" w:color="BFBFBF" w:sz="4"/>
+              <w:bottom w:val="single" w:color="BFBFBF" w:sz="4"/>
+              <w:right w:val="single" w:color="BFBFBF" w:sz="4"/>
+            </w:tcBorders>
+            <w:tcMar>
+              <w:top w:type="dxa" w:w="40"/>
+              <w:left w:type="dxa" w:w="80"/>
+              <w:bottom w:type="dxa" w:w="40"/>
+              <w:right w:type="dxa" w:w="80"/>
+            </w:tcMar>
+          </w:tcPr>
+          <w:p>
+            <w:r>
+              <w:rPr>
+                <w:b w:val="false"/>
+                <w:bCs w:val="false"/>
+                <w:sz w:val="16"/>
+                <w:szCs w:val="16"/>
+              </w:rPr>
+              <w:t xml:space="preserve">2026-11-26</w:t>
+            </w:r>
+          </w:p>
+        </w:tc>
+      </w:tr>
+      <w:tr>
+        <w:trPr>
+          <w:tblHeader w:val="off"/>
+        </w:trPr>
+        <w:tc>
+          <w:tcPr>
+            <w:tcW w:type="dxa" w:w="1560"/>
+            <w:tcBorders>
+              <w:top w:val="single" w:color="BFBFBF" w:sz="4"/>
+              <w:left w:val="single" w:color="BFBFBF" w:sz="4"/>
+              <w:bottom w:val="single" w:color="BFBFBF" w:sz="4"/>
+              <w:right w:val="single" w:color="BFBFBF" w:sz="4"/>
+            </w:tcBorders>
+            <w:tcMar>
+              <w:top w:type="dxa" w:w="40"/>
+              <w:left w:type="dxa" w:w="80"/>
+              <w:bottom w:type="dxa" w:w="40"/>
+              <w:right w:type="dxa" w:w="80"/>
+            </w:tcMar>
+          </w:tcPr>
+          <w:p>
+            <w:r>
+              <w:rPr>
+                <w:b w:val="false"/>
+                <w:bCs w:val="false"/>
+                <w:sz w:val="16"/>
+                <w:szCs w:val="16"/>
+              </w:rPr>
+              <w:t xml:space="preserve">Queen</w:t>
+            </w:r>
+          </w:p>
+        </w:tc>
+        <w:tc>
+          <w:tcPr>
+            <w:tcW w:type="dxa" w:w="1560"/>
+            <w:tcBorders>
+              <w:top w:val="single" w:color="BFBFBF" w:sz="4"/>
+              <w:left w:val="single" w:color="BFBFBF" w:sz="4"/>
+              <w:bottom w:val="single" w:color="BFBFBF" w:sz="4"/>
+              <w:right w:val="single" w:color="BFBFBF" w:sz="4"/>
+            </w:tcBorders>
+            <w:tcMar>
+              <w:top w:type="dxa" w:w="40"/>
+              <w:left w:type="dxa" w:w="80"/>
+              <w:bottom w:type="dxa" w:w="40"/>
+              <w:right w:type="dxa" w:w="80"/>
+            </w:tcMar>
+          </w:tcPr>
+          <w:p>
+            <w:r>
+              <w:rPr>
+                <w:b w:val="false"/>
+                <w:bCs w:val="false"/>
+                <w:sz w:val="16"/>
+                <w:szCs w:val="16"/>
+              </w:rPr>
+              <w:t xml:space="preserve">SATIN-QUEEN-BLACK</w:t>
+            </w:r>
+          </w:p>
+        </w:tc>
+        <w:tc>
+          <w:tcPr>
+            <w:tcW w:type="dxa" w:w="1560"/>
+            <w:tcBorders>
+              <w:top w:val="single" w:color="BFBFBF" w:sz="4"/>
+              <w:left w:val="single" w:color="BFBFBF" w:sz="4"/>
+              <w:bottom w:val="single" w:color="BFBFBF" w:sz="4"/>
+              <w:right w:val="single" w:color="BFBFBF" w:sz="4"/>
+            </w:tcBorders>
+            <w:tcMar>
+              <w:top w:type="dxa" w:w="40"/>
+              <w:left w:type="dxa" w:w="80"/>
+              <w:bottom w:type="dxa" w:w="40"/>
+              <w:right w:type="dxa" w:w="80"/>
+            </w:tcMar>
+          </w:tcPr>
+          <w:p>
+            <w:r>
+              <w:rPr>
+                <w:b w:val="false"/>
+                <w:bCs w:val="false"/>
+                <w:sz w:val="16"/>
+                <w:szCs w:val="16"/>
+              </w:rPr>
+              <w:t xml:space="preserve">#2 SATIN-4PCS-QUEEN-STONE-GREY</w:t>
+            </w:r>
+          </w:p>
+        </w:tc>
+        <w:tc>
+          <w:tcPr>
+            <w:tcW w:type="dxa" w:w="1560"/>
+            <w:tcBorders>
+              <w:top w:val="single" w:color="BFBFBF" w:sz="4"/>
+              <w:left w:val="single" w:color="BFBFBF" w:sz="4"/>
+              <w:bottom w:val="single" w:color="BFBFBF" w:sz="4"/>
+              <w:right w:val="single" w:color="BFBFBF" w:sz="4"/>
+            </w:tcBorders>
+            <w:tcMar>
+              <w:top w:type="dxa" w:w="40"/>
+              <w:left w:type="dxa" w:w="80"/>
+              <w:bottom w:type="dxa" w:w="40"/>
+              <w:right w:type="dxa" w:w="80"/>
+            </w:tcMar>
+          </w:tcPr>
+          <w:p>
+            <w:r>
+              <w:rPr>
+                <w:b w:val="false"/>
+                <w:bCs w:val="false"/>
+                <w:sz w:val="16"/>
+                <w:szCs w:val="16"/>
+              </w:rPr>
+              <w:t xml:space="preserve">maintain only</w:t>
+            </w:r>
+          </w:p>
+        </w:tc>
+        <w:tc>
+          <w:tcPr>
+            <w:tcW w:type="dxa" w:w="1560"/>
+            <w:tcBorders>
+              <w:top w:val="single" w:color="BFBFBF" w:sz="4"/>
+              <w:left w:val="single" w:color="BFBFBF" w:sz="4"/>
+              <w:bottom w:val="single" w:color="BFBFBF" w:sz="4"/>
+              <w:right w:val="single" w:color="BFBFBF" w:sz="4"/>
+            </w:tcBorders>
+            <w:tcMar>
+              <w:top w:type="dxa" w:w="40"/>
+              <w:left w:type="dxa" w:w="80"/>
+              <w:bottom w:type="dxa" w:w="40"/>
+              <w:right w:type="dxa" w:w="80"/>
+            </w:tcMar>
+          </w:tcPr>
+          <w:p>
+            <w:r>
+              <w:rPr>
+                <w:b w:val="false"/>
+                <w:bCs w:val="false"/>
+                <w:sz w:val="16"/>
+                <w:szCs w:val="16"/>
+              </w:rPr>
+              <w:t xml:space="preserve">2026-11-26</w:t>
+            </w:r>
+          </w:p>
+        </w:tc>
+        <w:tc>
+          <w:tcPr>
+            <w:tcW w:type="dxa" w:w="1560"/>
+            <w:tcBorders>
+              <w:top w:val="single" w:color="BFBFBF" w:sz="4"/>
+              <w:left w:val="single" w:color="BFBFBF" w:sz="4"/>
+              <w:bottom w:val="single" w:color="BFBFBF" w:sz="4"/>
+              <w:right w:val="single" w:color="BFBFBF" w:sz="4"/>
+            </w:tcBorders>
+            <w:tcMar>
+              <w:top w:type="dxa" w:w="40"/>
+              <w:left w:type="dxa" w:w="80"/>
+              <w:bottom w:type="dxa" w:w="40"/>
+              <w:right w:type="dxa" w:w="80"/>
+            </w:tcMar>
+          </w:tcPr>
+          <w:p>
+            <w:r>
+              <w:rPr>
+                <w:b w:val="false"/>
+                <w:bCs w:val="false"/>
+                <w:sz w:val="16"/>
+                <w:szCs w:val="16"/>
+              </w:rPr>
+              <w:t xml:space="preserve">2026-12-10</w:t>
+            </w:r>
+          </w:p>
+        </w:tc>
+      </w:tr>
+      <w:tr>
+        <w:trPr>
+          <w:tblHeader w:val="off"/>
+        </w:trPr>
+        <w:tc>
+          <w:tcPr>
+            <w:tcW w:type="dxa" w:w="1560"/>
+            <w:tcBorders>
+              <w:top w:val="single" w:color="BFBFBF" w:sz="4"/>
+              <w:left w:val="single" w:color="BFBFBF" w:sz="4"/>
+              <w:bottom w:val="single" w:color="BFBFBF" w:sz="4"/>
+              <w:right w:val="single" w:color="BFBFBF" w:sz="4"/>
+            </w:tcBorders>
+            <w:tcMar>
+              <w:top w:type="dxa" w:w="40"/>
+              <w:left w:type="dxa" w:w="80"/>
+              <w:bottom w:type="dxa" w:w="40"/>
+              <w:right w:type="dxa" w:w="80"/>
+            </w:tcMar>
+          </w:tcPr>
+          <w:p>
+            <w:r>
+              <w:rPr>
+                <w:b w:val="false"/>
+                <w:bCs w:val="false"/>
+                <w:sz w:val="16"/>
+                <w:szCs w:val="16"/>
+              </w:rPr>
+              <w:t xml:space="preserve">King</w:t>
+            </w:r>
+          </w:p>
+        </w:tc>
+        <w:tc>
+          <w:tcPr>
+            <w:tcW w:type="dxa" w:w="1560"/>
+            <w:tcBorders>
+              <w:top w:val="single" w:color="BFBFBF" w:sz="4"/>
+              <w:left w:val="single" w:color="BFBFBF" w:sz="4"/>
+              <w:bottom w:val="single" w:color="BFBFBF" w:sz="4"/>
+              <w:right w:val="single" w:color="BFBFBF" w:sz="4"/>
+            </w:tcBorders>
+            <w:tcMar>
+              <w:top w:type="dxa" w:w="40"/>
+              <w:left w:type="dxa" w:w="80"/>
+              <w:bottom w:type="dxa" w:w="40"/>
+              <w:right w:type="dxa" w:w="80"/>
+            </w:tcMar>
+          </w:tcPr>
+          <w:p>
+            <w:r>
+              <w:rPr>
+                <w:b w:val="false"/>
+                <w:bCs w:val="false"/>
+                <w:sz w:val="16"/>
+                <w:szCs w:val="16"/>
+              </w:rPr>
+              <w:t xml:space="preserve">SATIN-KING-BLACK</w:t>
+            </w:r>
+          </w:p>
+        </w:tc>
+        <w:tc>
+          <w:tcPr>
+            <w:tcW w:type="dxa" w:w="1560"/>
+            <w:tcBorders>
+              <w:top w:val="single" w:color="BFBFBF" w:sz="4"/>
+              <w:left w:val="single" w:color="BFBFBF" w:sz="4"/>
+              <w:bottom w:val="single" w:color="BFBFBF" w:sz="4"/>
+              <w:right w:val="single" w:color="BFBFBF" w:sz="4"/>
+            </w:tcBorders>
+            <w:tcMar>
+              <w:top w:type="dxa" w:w="40"/>
+              <w:left w:type="dxa" w:w="80"/>
+              <w:bottom w:type="dxa" w:w="40"/>
+              <w:right w:type="dxa" w:w="80"/>
+            </w:tcMar>
+          </w:tcPr>
+          <w:p>
+            <w:r>
+              <w:rPr>
+                <w:b w:val="false"/>
+                <w:bCs w:val="false"/>
+                <w:sz w:val="16"/>
+                <w:szCs w:val="16"/>
+              </w:rPr>
+              <w:t xml:space="preserve">#1 SATIN-4PCS-KING-RED</w:t>
+            </w:r>
+          </w:p>
+        </w:tc>
+        <w:tc>
+          <w:tcPr>
+            <w:tcW w:type="dxa" w:w="1560"/>
+            <w:tcBorders>
+              <w:top w:val="single" w:color="BFBFBF" w:sz="4"/>
+              <w:left w:val="single" w:color="BFBFBF" w:sz="4"/>
+              <w:bottom w:val="single" w:color="BFBFBF" w:sz="4"/>
+              <w:right w:val="single" w:color="BFBFBF" w:sz="4"/>
+            </w:tcBorders>
+            <w:tcMar>
+              <w:top w:type="dxa" w:w="40"/>
+              <w:left w:type="dxa" w:w="80"/>
+              <w:bottom w:type="dxa" w:w="40"/>
+              <w:right w:type="dxa" w:w="80"/>
+            </w:tcMar>
+          </w:tcPr>
+          <w:p>
+            <w:r>
+              <w:rPr>
+                <w:b w:val="false"/>
+                <w:bCs w:val="false"/>
+                <w:sz w:val="16"/>
+                <w:szCs w:val="16"/>
+              </w:rPr>
+              <w:t xml:space="preserve">push</w:t>
+            </w:r>
+          </w:p>
+        </w:tc>
+        <w:tc>
+          <w:tcPr>
+            <w:tcW w:type="dxa" w:w="1560"/>
+            <w:tcBorders>
+              <w:top w:val="single" w:color="BFBFBF" w:sz="4"/>
+              <w:left w:val="single" w:color="BFBFBF" w:sz="4"/>
+              <w:bottom w:val="single" w:color="BFBFBF" w:sz="4"/>
+              <w:right w:val="single" w:color="BFBFBF" w:sz="4"/>
+            </w:tcBorders>
+            <w:tcMar>
+              <w:top w:type="dxa" w:w="40"/>
+              <w:left w:type="dxa" w:w="80"/>
+              <w:bottom w:type="dxa" w:w="40"/>
+              <w:right w:type="dxa" w:w="80"/>
+            </w:tcMar>
+          </w:tcPr>
+          <w:p>
+            <w:r>
+              <w:rPr>
+                <w:b w:val="false"/>
+                <w:bCs w:val="false"/>
+                <w:sz w:val="16"/>
+                <w:szCs w:val="16"/>
+              </w:rPr>
+              <w:t xml:space="preserve">not before 31 Jan</w:t>
+            </w:r>
+          </w:p>
+        </w:tc>
+        <w:tc>
+          <w:tcPr>
+            <w:tcW w:type="dxa" w:w="1560"/>
+            <w:tcBorders>
+              <w:top w:val="single" w:color="BFBFBF" w:sz="4"/>
+              <w:left w:val="single" w:color="BFBFBF" w:sz="4"/>
+              <w:bottom w:val="single" w:color="BFBFBF" w:sz="4"/>
+              <w:right w:val="single" w:color="BFBFBF" w:sz="4"/>
+            </w:tcBorders>
+            <w:tcMar>
+              <w:top w:type="dxa" w:w="40"/>
+              <w:left w:type="dxa" w:w="80"/>
+              <w:bottom w:type="dxa" w:w="40"/>
+              <w:right w:type="dxa" w:w="80"/>
+            </w:tcMar>
+          </w:tcPr>
+          <w:p>
+            <w:r>
+              <w:rPr>
+                <w:b w:val="false"/>
+                <w:bCs w:val="false"/>
+                <w:sz w:val="16"/>
+                <w:szCs w:val="16"/>
+              </w:rPr>
+              <w:t xml:space="preserve">2027-01-05</w:t>
+            </w:r>
+          </w:p>
+        </w:tc>
+      </w:tr>
+      <w:tr>
+        <w:trPr>
+          <w:tblHeader w:val="off"/>
+        </w:trPr>
+        <w:tc>
+          <w:tcPr>
+            <w:tcW w:type="dxa" w:w="1560"/>
+            <w:tcBorders>
+              <w:top w:val="single" w:color="BFBFBF" w:sz="4"/>
+              <w:left w:val="single" w:color="BFBFBF" w:sz="4"/>
+              <w:bottom w:val="single" w:color="BFBFBF" w:sz="4"/>
+              <w:right w:val="single" w:color="BFBFBF" w:sz="4"/>
+            </w:tcBorders>
+            <w:tcMar>
+              <w:top w:type="dxa" w:w="40"/>
+              <w:left w:type="dxa" w:w="80"/>
+              <w:bottom w:type="dxa" w:w="40"/>
+              <w:right w:type="dxa" w:w="80"/>
+            </w:tcMar>
+          </w:tcPr>
+          <w:p>
+            <w:r>
+              <w:rPr>
+                <w:b w:val="false"/>
+                <w:bCs w:val="false"/>
+                <w:sz w:val="16"/>
+                <w:szCs w:val="16"/>
+              </w:rPr>
+              <w:t xml:space="preserve">King</w:t>
+            </w:r>
+          </w:p>
+        </w:tc>
+        <w:tc>
+          <w:tcPr>
+            <w:tcW w:type="dxa" w:w="1560"/>
+            <w:tcBorders>
+              <w:top w:val="single" w:color="BFBFBF" w:sz="4"/>
+              <w:left w:val="single" w:color="BFBFBF" w:sz="4"/>
+              <w:bottom w:val="single" w:color="BFBFBF" w:sz="4"/>
+              <w:right w:val="single" w:color="BFBFBF" w:sz="4"/>
+            </w:tcBorders>
+            <w:tcMar>
+              <w:top w:type="dxa" w:w="40"/>
+              <w:left w:type="dxa" w:w="80"/>
+              <w:bottom w:type="dxa" w:w="40"/>
+              <w:right w:type="dxa" w:w="80"/>
+            </w:tcMar>
+          </w:tcPr>
+          <w:p>
+            <w:r>
+              <w:rPr>
+                <w:b w:val="false"/>
+                <w:bCs w:val="false"/>
+                <w:sz w:val="16"/>
+                <w:szCs w:val="16"/>
+              </w:rPr>
+              <w:t xml:space="preserve">SATIN-KING-BLACK</w:t>
+            </w:r>
+          </w:p>
+        </w:tc>
+        <w:tc>
+          <w:tcPr>
+            <w:tcW w:type="dxa" w:w="1560"/>
+            <w:tcBorders>
+              <w:top w:val="single" w:color="BFBFBF" w:sz="4"/>
+              <w:left w:val="single" w:color="BFBFBF" w:sz="4"/>
+              <w:bottom w:val="single" w:color="BFBFBF" w:sz="4"/>
+              <w:right w:val="single" w:color="BFBFBF" w:sz="4"/>
+            </w:tcBorders>
+            <w:tcMar>
+              <w:top w:type="dxa" w:w="40"/>
+              <w:left w:type="dxa" w:w="80"/>
+              <w:bottom w:type="dxa" w:w="40"/>
+              <w:right w:type="dxa" w:w="80"/>
+            </w:tcMar>
+          </w:tcPr>
+          <w:p>
+            <w:r>
+              <w:rPr>
+                <w:b w:val="false"/>
+                <w:bCs w:val="false"/>
+                <w:sz w:val="16"/>
+                <w:szCs w:val="16"/>
+              </w:rPr>
+              <w:t xml:space="preserve">#2 SATIN-4PC-KING-GREY</w:t>
+            </w:r>
+          </w:p>
+        </w:tc>
+        <w:tc>
+          <w:tcPr>
+            <w:tcW w:type="dxa" w:w="1560"/>
+            <w:tcBorders>
+              <w:top w:val="single" w:color="BFBFBF" w:sz="4"/>
+              <w:left w:val="single" w:color="BFBFBF" w:sz="4"/>
+              <w:bottom w:val="single" w:color="BFBFBF" w:sz="4"/>
+              <w:right w:val="single" w:color="BFBFBF" w:sz="4"/>
+            </w:tcBorders>
+            <w:tcMar>
+              <w:top w:type="dxa" w:w="40"/>
+              <w:left w:type="dxa" w:w="80"/>
+              <w:bottom w:type="dxa" w:w="40"/>
+              <w:right w:type="dxa" w:w="80"/>
+            </w:tcMar>
+          </w:tcPr>
+          <w:p>
+            <w:r>
+              <w:rPr>
+                <w:b w:val="false"/>
+                <w:bCs w:val="false"/>
+                <w:sz w:val="16"/>
+                <w:szCs w:val="16"/>
+              </w:rPr>
+              <w:t xml:space="preserve">push</w:t>
+            </w:r>
+          </w:p>
+        </w:tc>
+        <w:tc>
+          <w:tcPr>
+            <w:tcW w:type="dxa" w:w="1560"/>
+            <w:tcBorders>
+              <w:top w:val="single" w:color="BFBFBF" w:sz="4"/>
+              <w:left w:val="single" w:color="BFBFBF" w:sz="4"/>
+              <w:bottom w:val="single" w:color="BFBFBF" w:sz="4"/>
+              <w:right w:val="single" w:color="BFBFBF" w:sz="4"/>
+            </w:tcBorders>
+            <w:tcMar>
+              <w:top w:type="dxa" w:w="40"/>
+              <w:left w:type="dxa" w:w="80"/>
+              <w:bottom w:type="dxa" w:w="40"/>
+              <w:right w:type="dxa" w:w="80"/>
+            </w:tcMar>
+          </w:tcPr>
+          <w:p>
+            <w:r>
+              <w:rPr>
+                <w:b w:val="false"/>
+                <w:bCs w:val="false"/>
+                <w:sz w:val="16"/>
+                <w:szCs w:val="16"/>
+              </w:rPr>
+              <w:t xml:space="preserve">not before 31 Jan</w:t>
+            </w:r>
+          </w:p>
+        </w:tc>
+        <w:tc>
+          <w:tcPr>
+            <w:tcW w:type="dxa" w:w="1560"/>
+            <w:tcBorders>
+              <w:top w:val="single" w:color="BFBFBF" w:sz="4"/>
+              <w:left w:val="single" w:color="BFBFBF" w:sz="4"/>
+              <w:bottom w:val="single" w:color="BFBFBF" w:sz="4"/>
+              <w:right w:val="single" w:color="BFBFBF" w:sz="4"/>
+            </w:tcBorders>
+            <w:tcMar>
+              <w:top w:type="dxa" w:w="40"/>
+              <w:left w:type="dxa" w:w="80"/>
+              <w:bottom w:type="dxa" w:w="40"/>
+              <w:right w:type="dxa" w:w="80"/>
+            </w:tcMar>
+          </w:tcPr>
+          <w:p>
+            <w:r>
+              <w:rPr>
+                <w:b w:val="false"/>
+                <w:bCs w:val="false"/>
+                <w:sz w:val="16"/>
+                <w:szCs w:val="16"/>
+              </w:rPr>
+              <w:t xml:space="preserve">after 31 Jan</w:t>
+            </w:r>
+          </w:p>
+        </w:tc>
+      </w:tr>
+      <w:tr>
+        <w:trPr>
+          <w:tblHeader w:val="off"/>
+        </w:trPr>
+        <w:tc>
+          <w:tcPr>
+            <w:tcW w:type="dxa" w:w="1560"/>
+            <w:tcBorders>
+              <w:top w:val="single" w:color="BFBFBF" w:sz="4"/>
+              <w:left w:val="single" w:color="BFBFBF" w:sz="4"/>
+              <w:bottom w:val="single" w:color="BFBFBF" w:sz="4"/>
+              <w:right w:val="single" w:color="BFBFBF" w:sz="4"/>
+            </w:tcBorders>
+            <w:tcMar>
+              <w:top w:type="dxa" w:w="40"/>
+              <w:left w:type="dxa" w:w="80"/>
+              <w:bottom w:type="dxa" w:w="40"/>
+              <w:right w:type="dxa" w:w="80"/>
+            </w:tcMar>
+          </w:tcPr>
+          <w:p>
+            <w:r>
+              <w:rPr>
+                <w:b w:val="false"/>
+                <w:bCs w:val="false"/>
+                <w:sz w:val="16"/>
+                <w:szCs w:val="16"/>
+              </w:rPr>
+              <w:t xml:space="preserve">Full</w:t>
+            </w:r>
+          </w:p>
+        </w:tc>
+        <w:tc>
+          <w:tcPr>
+            <w:tcW w:type="dxa" w:w="1560"/>
+            <w:tcBorders>
+              <w:top w:val="single" w:color="BFBFBF" w:sz="4"/>
+              <w:left w:val="single" w:color="BFBFBF" w:sz="4"/>
+              <w:bottom w:val="single" w:color="BFBFBF" w:sz="4"/>
+              <w:right w:val="single" w:color="BFBFBF" w:sz="4"/>
+            </w:tcBorders>
+            <w:tcMar>
+              <w:top w:type="dxa" w:w="40"/>
+              <w:left w:type="dxa" w:w="80"/>
+              <w:bottom w:type="dxa" w:w="40"/>
+              <w:right w:type="dxa" w:w="80"/>
+            </w:tcMar>
+          </w:tcPr>
+          <w:p>
+            <w:r>
+              <w:rPr>
+                <w:b w:val="false"/>
+                <w:bCs w:val="false"/>
+                <w:sz w:val="16"/>
+                <w:szCs w:val="16"/>
+              </w:rPr>
+              <w:t xml:space="preserve">SATIN-FULL-BLACK</w:t>
+            </w:r>
+          </w:p>
+        </w:tc>
+        <w:tc>
+          <w:tcPr>
+            <w:tcW w:type="dxa" w:w="1560"/>
+            <w:tcBorders>
+              <w:top w:val="single" w:color="BFBFBF" w:sz="4"/>
+              <w:left w:val="single" w:color="BFBFBF" w:sz="4"/>
+              <w:bottom w:val="single" w:color="BFBFBF" w:sz="4"/>
+              <w:right w:val="single" w:color="BFBFBF" w:sz="4"/>
+            </w:tcBorders>
+            <w:tcMar>
+              <w:top w:type="dxa" w:w="40"/>
+              <w:left w:type="dxa" w:w="80"/>
+              <w:bottom w:type="dxa" w:w="40"/>
+              <w:right w:type="dxa" w:w="80"/>
+            </w:tcMar>
+          </w:tcPr>
+          <w:p>
+            <w:r>
+              <w:rPr>
+                <w:b w:val="false"/>
+                <w:bCs w:val="false"/>
+                <w:sz w:val="16"/>
+                <w:szCs w:val="16"/>
+              </w:rPr>
+              <w:t xml:space="preserve">#1 SATIN-FULL-GREY</w:t>
+            </w:r>
+          </w:p>
+        </w:tc>
+        <w:tc>
+          <w:tcPr>
+            <w:tcW w:type="dxa" w:w="1560"/>
+            <w:tcBorders>
+              <w:top w:val="single" w:color="BFBFBF" w:sz="4"/>
+              <w:left w:val="single" w:color="BFBFBF" w:sz="4"/>
+              <w:bottom w:val="single" w:color="BFBFBF" w:sz="4"/>
+              <w:right w:val="single" w:color="BFBFBF" w:sz="4"/>
+            </w:tcBorders>
+            <w:tcMar>
+              <w:top w:type="dxa" w:w="40"/>
+              <w:left w:type="dxa" w:w="80"/>
+              <w:bottom w:type="dxa" w:w="40"/>
+              <w:right w:type="dxa" w:w="80"/>
+            </w:tcMar>
+          </w:tcPr>
+          <w:p>
+            <w:r>
+              <w:rPr>
+                <w:b w:val="false"/>
+                <w:bCs w:val="false"/>
+                <w:sz w:val="16"/>
+                <w:szCs w:val="16"/>
+              </w:rPr>
+              <w:t xml:space="preserve">maintain only</w:t>
+            </w:r>
+          </w:p>
+        </w:tc>
+        <w:tc>
+          <w:tcPr>
+            <w:tcW w:type="dxa" w:w="1560"/>
+            <w:tcBorders>
+              <w:top w:val="single" w:color="BFBFBF" w:sz="4"/>
+              <w:left w:val="single" w:color="BFBFBF" w:sz="4"/>
+              <w:bottom w:val="single" w:color="BFBFBF" w:sz="4"/>
+              <w:right w:val="single" w:color="BFBFBF" w:sz="4"/>
+            </w:tcBorders>
+            <w:tcMar>
+              <w:top w:type="dxa" w:w="40"/>
+              <w:left w:type="dxa" w:w="80"/>
+              <w:bottom w:type="dxa" w:w="40"/>
+              <w:right w:type="dxa" w:w="80"/>
+            </w:tcMar>
+          </w:tcPr>
+          <w:p>
+            <w:r>
+              <w:rPr>
+                <w:b w:val="false"/>
+                <w:bCs w:val="false"/>
+                <w:sz w:val="16"/>
+                <w:szCs w:val="16"/>
+              </w:rPr>
+              <w:t xml:space="preserve">2026-10-26</w:t>
+            </w:r>
+          </w:p>
+        </w:tc>
+        <w:tc>
+          <w:tcPr>
+            <w:tcW w:type="dxa" w:w="1560"/>
+            <w:tcBorders>
+              <w:top w:val="single" w:color="BFBFBF" w:sz="4"/>
+              <w:left w:val="single" w:color="BFBFBF" w:sz="4"/>
+              <w:bottom w:val="single" w:color="BFBFBF" w:sz="4"/>
+              <w:right w:val="single" w:color="BFBFBF" w:sz="4"/>
+            </w:tcBorders>
+            <w:tcMar>
+              <w:top w:type="dxa" w:w="40"/>
+              <w:left w:type="dxa" w:w="80"/>
+              <w:bottom w:type="dxa" w:w="40"/>
+              <w:right w:type="dxa" w:w="80"/>
+            </w:tcMar>
+          </w:tcPr>
+          <w:p>
+            <w:r>
+              <w:rPr>
+                <w:b w:val="false"/>
+                <w:bCs w:val="false"/>
+                <w:sz w:val="16"/>
+                <w:szCs w:val="16"/>
+              </w:rPr>
+              <w:t xml:space="preserve">2026-11-20</w:t>
+            </w:r>
+          </w:p>
+        </w:tc>
+      </w:tr>
+      <w:tr>
+        <w:trPr>
+          <w:tblHeader w:val="off"/>
+        </w:trPr>
+        <w:tc>
+          <w:tcPr>
+            <w:tcW w:type="dxa" w:w="1560"/>
+            <w:tcBorders>
+              <w:top w:val="single" w:color="BFBFBF" w:sz="4"/>
+              <w:left w:val="single" w:color="BFBFBF" w:sz="4"/>
+              <w:bottom w:val="single" w:color="BFBFBF" w:sz="4"/>
+              <w:right w:val="single" w:color="BFBFBF" w:sz="4"/>
+            </w:tcBorders>
+            <w:tcMar>
+              <w:top w:type="dxa" w:w="40"/>
+              <w:left w:type="dxa" w:w="80"/>
+              <w:bottom w:type="dxa" w:w="40"/>
+              <w:right w:type="dxa" w:w="80"/>
+            </w:tcMar>
+          </w:tcPr>
+          <w:p>
+            <w:r>
+              <w:rPr>
+                <w:b w:val="false"/>
+                <w:bCs w:val="false"/>
+                <w:sz w:val="16"/>
+                <w:szCs w:val="16"/>
+              </w:rPr>
+              <w:t xml:space="preserve">Twin</w:t>
+            </w:r>
+          </w:p>
+        </w:tc>
+        <w:tc>
+          <w:tcPr>
+            <w:tcW w:type="dxa" w:w="1560"/>
+            <w:tcBorders>
+              <w:top w:val="single" w:color="BFBFBF" w:sz="4"/>
+              <w:left w:val="single" w:color="BFBFBF" w:sz="4"/>
+              <w:bottom w:val="single" w:color="BFBFBF" w:sz="4"/>
+              <w:right w:val="single" w:color="BFBFBF" w:sz="4"/>
+            </w:tcBorders>
+            <w:tcMar>
+              <w:top w:type="dxa" w:w="40"/>
+              <w:left w:type="dxa" w:w="80"/>
+              <w:bottom w:type="dxa" w:w="40"/>
+              <w:right w:type="dxa" w:w="80"/>
+            </w:tcMar>
+          </w:tcPr>
+          <w:p>
+            <w:r>
+              <w:rPr>
+                <w:b w:val="false"/>
+                <w:bCs w:val="false"/>
+                <w:sz w:val="16"/>
+                <w:szCs w:val="16"/>
+              </w:rPr>
+              <w:t xml:space="preserve">SATIN-TWIN-BLACK-NEW</w:t>
+            </w:r>
+          </w:p>
+        </w:tc>
+        <w:tc>
+          <w:tcPr>
+            <w:tcW w:type="dxa" w:w="1560"/>
+            <w:tcBorders>
+              <w:top w:val="single" w:color="BFBFBF" w:sz="4"/>
+              <w:left w:val="single" w:color="BFBFBF" w:sz="4"/>
+              <w:bottom w:val="single" w:color="BFBFBF" w:sz="4"/>
+              <w:right w:val="single" w:color="BFBFBF" w:sz="4"/>
+            </w:tcBorders>
+            <w:tcMar>
+              <w:top w:type="dxa" w:w="40"/>
+              <w:left w:type="dxa" w:w="80"/>
+              <w:bottom w:type="dxa" w:w="40"/>
+              <w:right w:type="dxa" w:w="80"/>
+            </w:tcMar>
+          </w:tcPr>
+          <w:p>
+            <w:r>
+              <w:rPr>
+                <w:b w:val="false"/>
+                <w:bCs w:val="false"/>
+                <w:sz w:val="16"/>
+                <w:szCs w:val="16"/>
+              </w:rPr>
+              <w:t xml:space="preserve">#1 SATIN-TWIN-PINK</w:t>
+            </w:r>
+          </w:p>
+        </w:tc>
+        <w:tc>
+          <w:tcPr>
+            <w:tcW w:type="dxa" w:w="1560"/>
+            <w:tcBorders>
+              <w:top w:val="single" w:color="BFBFBF" w:sz="4"/>
+              <w:left w:val="single" w:color="BFBFBF" w:sz="4"/>
+              <w:bottom w:val="single" w:color="BFBFBF" w:sz="4"/>
+              <w:right w:val="single" w:color="BFBFBF" w:sz="4"/>
+            </w:tcBorders>
+            <w:tcMar>
+              <w:top w:type="dxa" w:w="40"/>
+              <w:left w:type="dxa" w:w="80"/>
+              <w:bottom w:type="dxa" w:w="40"/>
+              <w:right w:type="dxa" w:w="80"/>
+            </w:tcMar>
+          </w:tcPr>
+          <w:p>
+            <w:r>
+              <w:rPr>
+                <w:b w:val="false"/>
+                <w:bCs w:val="false"/>
+                <w:sz w:val="16"/>
+                <w:szCs w:val="16"/>
+              </w:rPr>
+              <w:t xml:space="preserve">push (small seller, estimate)</w:t>
+            </w:r>
+          </w:p>
+        </w:tc>
+        <w:tc>
+          <w:tcPr>
+            <w:tcW w:type="dxa" w:w="1560"/>
+            <w:tcBorders>
+              <w:top w:val="single" w:color="BFBFBF" w:sz="4"/>
+              <w:left w:val="single" w:color="BFBFBF" w:sz="4"/>
+              <w:bottom w:val="single" w:color="BFBFBF" w:sz="4"/>
+              <w:right w:val="single" w:color="BFBFBF" w:sz="4"/>
+            </w:tcBorders>
+            <w:tcMar>
+              <w:top w:type="dxa" w:w="40"/>
+              <w:left w:type="dxa" w:w="80"/>
+              <w:bottom w:type="dxa" w:w="40"/>
+              <w:right w:type="dxa" w:w="80"/>
+            </w:tcMar>
+          </w:tcPr>
+          <w:p>
+            <w:r>
+              <w:rPr>
+                <w:b w:val="false"/>
+                <w:bCs w:val="false"/>
+                <w:sz w:val="16"/>
+                <w:szCs w:val="16"/>
+              </w:rPr>
+              <w:t xml:space="preserve">2026-10-26</w:t>
+            </w:r>
+          </w:p>
+        </w:tc>
+        <w:tc>
+          <w:tcPr>
+            <w:tcW w:type="dxa" w:w="1560"/>
+            <w:tcBorders>
+              <w:top w:val="single" w:color="BFBFBF" w:sz="4"/>
+              <w:left w:val="single" w:color="BFBFBF" w:sz="4"/>
+              <w:bottom w:val="single" w:color="BFBFBF" w:sz="4"/>
+              <w:right w:val="single" w:color="BFBFBF" w:sz="4"/>
+            </w:tcBorders>
+            <w:tcMar>
+              <w:top w:type="dxa" w:w="40"/>
+              <w:left w:type="dxa" w:w="80"/>
+              <w:bottom w:type="dxa" w:w="40"/>
+              <w:right w:type="dxa" w:w="80"/>
+            </w:tcMar>
+          </w:tcPr>
+          <w:p>
+            <w:r>
+              <w:rPr>
+                <w:b w:val="false"/>
+                <w:bCs w:val="false"/>
+                <w:sz w:val="16"/>
+                <w:szCs w:val="16"/>
+              </w:rPr>
+              <w:t xml:space="preserve">after 31 Jan</w:t>
+            </w:r>
+          </w:p>
+        </w:tc>
+      </w:tr>
+    </w:tbl>
+    <w:p>
+      <w:pPr>
+        <w:spacing w:after="120"/>
+      </w:pPr>
+    </w:p>
+    <w:p>
+      <w:pPr>
+        <w:spacing w:after="120"/>
+      </w:pPr>
+      <w:r>
+        <w:t xml:space="preserve">Queen: at the plan's pace Queen Black falls under 14 days around 2026-11-14. SATIN-QUEEN-GREY then carries the Queen ranking terms at maintain level until about 2026-11-26, then SATIN-4PCS-QUEEN-STONE-GREY until about 2026-12-10. After that, no Queen child can carry the ranking terms, so the Queen Black reorder has to land by then. Full: Full Black switches to SATIN-FULL-GREY around 2026-10-26, which lasts to about 2026-11-20. King: King Black does not need its back-ups before 31 Jan.</w:t>
+      </w:r>
     </w:p>
     <w:p>
       <w:pPr>
@@ -18553,7 +19840,7 @@
         <w:spacing w:after="80"/>
       </w:pPr>
       <w:r>
-        <w:t xml:space="preserve">Under the plan, Queen Grey sells about 11.73 units a day (September equivalent, before the Q4 lift) and clears around 2026-12-01.</w:t>
+        <w:t xml:space="preserve">Under the plan, Queen Grey sells about 10.73 units a day (September equivalent, before the Q4 lift) and clears around 2026-12-05.</w:t>
       </w:r>
     </w:p>
     <w:p>
@@ -19114,7 +20401,7 @@
                 <w:sz w:val="16"/>
                 <w:szCs w:val="16"/>
               </w:rPr>
-              <w:t xml:space="preserve">15.17</w:t>
+              <w:t xml:space="preserve">15.06</w:t>
             </w:r>
           </w:p>
         </w:tc>
@@ -19198,7 +20485,7 @@
                 <w:sz w:val="16"/>
                 <w:szCs w:val="16"/>
               </w:rPr>
-              <w:t xml:space="preserve">2,613</w:t>
+              <w:t xml:space="preserve">2,589</w:t>
             </w:r>
           </w:p>
         </w:tc>
@@ -19516,7 +20803,7 @@
                 <w:sz w:val="16"/>
                 <w:szCs w:val="16"/>
               </w:rPr>
-              <w:t xml:space="preserve">20.86</w:t>
+              <w:t xml:space="preserve">20.49</w:t>
             </w:r>
           </w:p>
         </w:tc>
@@ -19572,7 +20859,7 @@
                 <w:sz w:val="16"/>
                 <w:szCs w:val="16"/>
               </w:rPr>
-              <w:t xml:space="preserve">2026-11-26</w:t>
+              <w:t xml:space="preserve">2026-11-27</w:t>
             </w:r>
           </w:p>
         </w:tc>
@@ -19600,7 +20887,7 @@
                 <w:sz w:val="16"/>
                 <w:szCs w:val="16"/>
               </w:rPr>
-              <w:t xml:space="preserve">2,774</w:t>
+              <w:t xml:space="preserve">2,692</w:t>
             </w:r>
           </w:p>
         </w:tc>
@@ -19717,7 +21004,7 @@
                 <w:sz w:val="16"/>
                 <w:szCs w:val="16"/>
               </w:rPr>
-              <w:t xml:space="preserve">11.73</w:t>
+              <w:t xml:space="preserve">10.73</w:t>
             </w:r>
           </w:p>
         </w:tc>
@@ -19773,7 +21060,7 @@
                 <w:sz w:val="16"/>
                 <w:szCs w:val="16"/>
               </w:rPr>
-              <w:t xml:space="preserve">2026-12-01</w:t>
+              <w:t xml:space="preserve">2026-12-05</w:t>
             </w:r>
           </w:p>
         </w:tc>
@@ -19801,7 +21088,7 @@
                 <w:sz w:val="16"/>
                 <w:szCs w:val="16"/>
               </w:rPr>
-              <w:t xml:space="preserve">1,446</w:t>
+              <w:t xml:space="preserve">1,224</w:t>
             </w:r>
           </w:p>
         </w:tc>
@@ -19918,7 +21205,7 @@
                 <w:sz w:val="16"/>
                 <w:szCs w:val="16"/>
               </w:rPr>
-              <w:t xml:space="preserve">1.96</w:t>
+              <w:t xml:space="preserve">1.83</w:t>
             </w:r>
           </w:p>
         </w:tc>
@@ -19974,7 +21261,7 @@
                 <w:sz w:val="16"/>
                 <w:szCs w:val="16"/>
               </w:rPr>
-              <w:t xml:space="preserve">2026-11-04</w:t>
+              <w:t xml:space="preserve">2026-11-06</w:t>
             </w:r>
           </w:p>
         </w:tc>
@@ -20002,7 +21289,7 @@
                 <w:sz w:val="16"/>
                 <w:szCs w:val="16"/>
               </w:rPr>
-              <w:t xml:space="preserve">342</w:t>
+              <w:t xml:space="preserve">313</w:t>
             </w:r>
           </w:p>
         </w:tc>
@@ -20464,7 +21751,7 @@
                 <w:sz w:val="16"/>
                 <w:szCs w:val="16"/>
               </w:rPr>
-              <w:t xml:space="preserve">$124,084</w:t>
+              <w:t xml:space="preserve">$120,561</w:t>
             </w:r>
           </w:p>
         </w:tc>
@@ -20492,7 +21779,7 @@
                 <w:sz w:val="16"/>
                 <w:szCs w:val="16"/>
               </w:rPr>
-              <w:t xml:space="preserve">$28,703</w:t>
+              <w:t xml:space="preserve">$27,434</w:t>
             </w:r>
           </w:p>
         </w:tc>
@@ -20520,7 +21807,7 @@
                 <w:sz w:val="16"/>
                 <w:szCs w:val="16"/>
               </w:rPr>
-              <w:t xml:space="preserve">23.1%</w:t>
+              <w:t xml:space="preserve">22.8%</w:t>
             </w:r>
           </w:p>
         </w:tc>
@@ -20548,7 +21835,7 @@
                 <w:sz w:val="16"/>
                 <w:szCs w:val="16"/>
               </w:rPr>
-              <w:t xml:space="preserve">$-351</w:t>
+              <w:t xml:space="preserve">$210</w:t>
             </w:r>
           </w:p>
         </w:tc>
@@ -20576,7 +21863,7 @@
                 <w:sz w:val="16"/>
                 <w:szCs w:val="16"/>
               </w:rPr>
-              <w:t xml:space="preserve">-0.3%</w:t>
+              <w:t xml:space="preserve">0.2%</w:t>
             </w:r>
           </w:p>
         </w:tc>
@@ -20637,7 +21924,7 @@
                 <w:sz w:val="16"/>
                 <w:szCs w:val="16"/>
               </w:rPr>
-              <w:t xml:space="preserve">$-1,197</w:t>
+              <w:t xml:space="preserve">$-3,825</w:t>
             </w:r>
           </w:p>
         </w:tc>
@@ -20665,7 +21952,7 @@
                 <w:sz w:val="16"/>
                 <w:szCs w:val="16"/>
               </w:rPr>
-              <w:t xml:space="preserve">$-602</w:t>
+              <w:t xml:space="preserve">$-1,712</w:t>
             </w:r>
           </w:p>
         </w:tc>
@@ -20721,7 +22008,7 @@
                 <w:sz w:val="16"/>
                 <w:szCs w:val="16"/>
               </w:rPr>
-              <w:t xml:space="preserve">$382</w:t>
+              <w:t xml:space="preserve">$899</w:t>
             </w:r>
           </w:p>
         </w:tc>
@@ -21156,7 +22443,7 @@
                 <w:sz w:val="16"/>
                 <w:szCs w:val="16"/>
               </w:rPr>
-              <w:t xml:space="preserve">$-1,270</w:t>
+              <w:t xml:space="preserve">$-1,611</w:t>
             </w:r>
           </w:p>
         </w:tc>
@@ -21184,7 +22471,7 @@
                 <w:sz w:val="16"/>
                 <w:szCs w:val="16"/>
               </w:rPr>
-              <w:t xml:space="preserve">$-491</w:t>
+              <w:t xml:space="preserve">$-576</w:t>
             </w:r>
           </w:p>
         </w:tc>
@@ -21240,7 +22527,7 @@
                 <w:sz w:val="16"/>
                 <w:szCs w:val="16"/>
               </w:rPr>
-              <w:t xml:space="preserve">$320</w:t>
+              <w:t xml:space="preserve">$367</w:t>
             </w:r>
           </w:p>
         </w:tc>
@@ -21329,7 +22616,7 @@
                 <w:sz w:val="16"/>
                 <w:szCs w:val="16"/>
               </w:rPr>
-              <w:t xml:space="preserve">$0</w:t>
+              <w:t xml:space="preserve">$-554</w:t>
             </w:r>
           </w:p>
         </w:tc>
@@ -21357,7 +22644,7 @@
                 <w:sz w:val="16"/>
                 <w:szCs w:val="16"/>
               </w:rPr>
-              <w:t xml:space="preserve">$0</w:t>
+              <w:t xml:space="preserve">$-73</w:t>
             </w:r>
           </w:p>
         </w:tc>
@@ -21413,7 +22700,7 @@
                 <w:sz w:val="16"/>
                 <w:szCs w:val="16"/>
               </w:rPr>
-              <w:t xml:space="preserve">$0</w:t>
+              <w:t xml:space="preserve">$-2</w:t>
             </w:r>
           </w:p>
         </w:tc>
@@ -21479,7 +22766,7 @@
         <w:spacing w:after="80"/>
       </w:pPr>
       <w:r>
-        <w:t xml:space="preserve">1. Stock: place the reorder for Queen Black (~2,774), Full Black (~2,613) and Twin Black (~342), sized to 31 Jan at the plan's pace. Confirm the Queen Black count in Seller Central first.</w:t>
+        <w:t xml:space="preserve">1. Stock: place the reorder for Queen Black (~2,692), Full Black (~2,589) and Twin Black (~313), sized to 31 Jan at the plan's pace. Confirm the Queen Black count in Seller Central first.</w:t>
       </w:r>
     </w:p>
     <w:p>
@@ -21505,7 +22792,20 @@
         <w:spacing w:after="80"/>
       </w:pPr>
       <w:r>
-        <w:t xml:space="preserve">3. Pause the duplicate exact campaigns listed. Their terms are owned by one campaign on the preferred child.</w:t>
+        <w:t xml:space="preserve">3. Pause the duplicate exact campaigns listed. Their terms are owned by one campaign on the preferred child. In every ranking campaign, load the back-up child's product ad PAUSED (Back-up ranking child tab).</w:t>
+      </w:r>
+    </w:p>
+    <w:p>
+      <w:pPr>
+        <w:pStyle w:val="ListParagraph"/>
+        <w:numPr>
+          <w:ilvl w:val="0"/>
+          <w:numId w:val="2"/>
+        </w:numPr>
+        <w:spacing w:after="80"/>
+      </w:pPr>
+      <w:r>
+        <w:t xml:space="preserve">3a. Every other enabled exact campaign: TOS 900% / ROS 0% / PP 0% with the base bids shown, unless the Campaigns tab marks it as the exception.</w:t>
       </w:r>
     </w:p>
     <w:p>
@@ -21557,7 +22857,7 @@
         <w:spacing w:after="80"/>
       </w:pPr>
       <w:r>
-        <w:t xml:space="preserve">When Queen Grey is down to about two weeks of stock (the plan clears it around 2026-12-01), switch the campaigns routed to it to Queen Stone Grey, LTSF #2 (~235 aged units left).</w:t>
+        <w:t xml:space="preserve">When Queen Grey is down to about two weeks of stock (the plan clears it around 2026-12-05), switch the campaigns routed to it to Queen Stone Grey, LTSF #2 (~235 aged units left).</w:t>
       </w:r>
     </w:p>
     <w:p>
@@ -21570,7 +22870,7 @@
         <w:spacing w:after="80"/>
       </w:pPr>
       <w:r>
-        <w:t xml:space="preserve">7. Daily check for two weeks: ranking clicks against target, top-of-search share, rank on each push term (Rank Radar), and Queen/Full Black days of cover.</w:t>
+        <w:t xml:space="preserve">7. Daily check for two weeks: ranking clicks against target, top-of-search share, rank on each push term (Rank Radar), and days of cover on every preferred child. Under 14 days, switch to the back-up.</w:t>
       </w:r>
     </w:p>
     <w:p>
@@ -21631,7 +22931,7 @@
         <w:spacing w:after="80"/>
       </w:pPr>
       <w:r>
-        <w:t xml:space="preserve">If the reorder cannot land before about 2026-11-26 (Queen) or 2026-11-05 (Full), stop that size's push about two weeks earlier. Rank built on stock that runs out in peak season is lost.</w:t>
+        <w:t xml:space="preserve">If the reorder cannot land before about 2026-11-27 (Queen) or 2026-11-05 (Full), stop that size's push about two weeks earlier. Rank built on stock that runs out in peak season is lost.</w:t>
       </w:r>
     </w:p>
     <w:p>

</xml_diff>

<commit_message>
DSS4 + DSS6: top-of-search bid never set below today's effective bid on ranking terms
The ranking price was taken from the average top-of-search CPC, which is what a winning
bid paid (second price), so it lowered bids that win today. Ranking terms now keep at least
today's effective top-of-search bid (bid x current modifier); base bids round up to the cent.
New automated check added (S6 48/48, S4 44/44 pass).

Co-Authored-By: Claude Opus 5.5 <noreply@anthropic.com>
Claude-Session: https://claude.ai/code/session_01LY7A1KPDoE1cQtWdmceR2R
</commit_message>
<xml_diff>
--- a/docs/DSS4_Audit_Review_20260929.docx
+++ b/docs/DSS4_Audit_Review_20260929.docx
@@ -10717,7 +10717,7 @@
                 <w:sz w:val="16"/>
                 <w:szCs w:val="16"/>
               </w:rPr>
-              <w:t xml:space="preserve">base $0.34 with TOS 900% → top-of-search price $3.4</w:t>
+              <w:t xml:space="preserve">base $0.46 with TOS 900% → top-of-search price $4.6</w:t>
             </w:r>
           </w:p>
         </w:tc>
@@ -11582,7 +11582,7 @@
                 <w:sz w:val="16"/>
                 <w:szCs w:val="16"/>
               </w:rPr>
-              <w:t xml:space="preserve">base $0.35 with TOS 900% → top-of-search price $3.5</w:t>
+              <w:t xml:space="preserve">base $0.36 with TOS 900% → top-of-search price $3.6</w:t>
             </w:r>
           </w:p>
         </w:tc>
@@ -14985,7 +14985,7 @@
         <w:spacing w:after="120"/>
       </w:pPr>
       <w:r>
-        <w:t xml:space="preserve">How it is set: modifier 900% (the maximum), base bid = the top-of-search price ÷ 10, rest of search and product pages 0%, bidding "Dynamic – down only". The top-of-search price is today's top-of-search CPC on the term, never cut. Rest of search and product pages then see only the tiny base bid (e.g. $0.23), so nearly all clicks come from the top row. Where a ranking campaign buys fewer clicks than its target and the budget is not spent, the top-of-search price is raised 10% at a time.</w:t>
+        <w:t xml:space="preserve">How it is set: modifier 900% (the maximum), base bid = the top-of-search price ÷ 10, rest of search and product pages 0%, bidding "Dynamic – down only". The top-of-search bid on a ranking term is never set below today's effective top-of-search bid (bid × current modifier): a CPC is the price the winning bid paid, so bidding at the CPC would lose auctions we win today. Where today's top-of-search CPC is higher than today's bid, the higher figure is used. Base bids round up to the cent. Rest of search and product pages then see only the tiny base bid (e.g. $0.23), so nearly all clicks come from the top row. Where a ranking campaign buys fewer clicks than its target and the budget is not spent, the top-of-search price is raised 10% at a time.</w:t>
       </w:r>
     </w:p>
     <w:p>

</xml_diff>

<commit_message>
DSS4: port shared engine fixes from the S6 review
LTSF storage-avoided per unit no longer multiplied by months on hand; no-op
LEGACY_FOR_SALES strategy rows dropped; maintain terms keep their own
top-of-search bid; LTSF campaigns pause only out-of-stock non-LTSF ads and
never add ranking children; keyword changes, a loadable bulk upload (with
SKU) and a needs-console-IDs list move into the action plan.

Co-Authored-By: Claude Opus 5.5 <noreply@anthropic.com>
Claude-Session: https://claude.ai/code/session_01LY7A1KPDoE1cQtWdmceR2R
</commit_message>
<xml_diff>
--- a/docs/DSS4_Audit_Review_20260929.docx
+++ b/docs/DSS4_Audit_Review_20260929.docx
@@ -100,7 +100,7 @@
         <w:spacing w:after="80"/>
       </w:pPr>
       <w:r>
-        <w:t xml:space="preserve">Spend share: today ranking campaigns take 46% of spend and 30% of clicks. After the plan they take 67% of all spend, or 83% once the LTSF clearance and brand-defence budgets are ring-fenced. Reaching 80% of all spend would need non-ranking cut to $141/day, about 60% below plan. That would stop the LTSF clearance, so it is set out as an owner decision rather than done automatically.</w:t>
+        <w:t xml:space="preserve">Spend share: today ranking campaigns take 46% of spend and 30% of clicks. After the plan they take 68% of all spend, or 83% once the LTSF clearance and brand-defence budgets are ring-fenced. Reaching 80% of all spend would need non-ranking cut to $141/day, about 60% below plan. That would stop the LTSF clearance, so it is set out as an owner decision rather than done automatically.</w:t>
       </w:r>
     </w:p>
     <w:p>
@@ -113,7 +113,7 @@
         <w:spacing w:after="80"/>
       </w:pPr>
       <w:r>
-        <w:t xml:space="preserve">Top of search, for every exact campaign: 64 ranking campaigns and 226 other exact campaigns go top-of-search only: a 900% modifier, the base bid at one tenth of the top-of-search price, and rest of search and product pages at 0%. The only exception would be a campaign whose own data shows top of search converting significantly worse; none does.</w:t>
+        <w:t xml:space="preserve">Top of search, for every exact campaign: 62 ranking campaigns and 226 other exact campaigns go top-of-search only: a 900% modifier, the base bid at one tenth of the top-of-search price, and rest of search and product pages at 0%. The only exception would be a campaign whose own data shows top of search converting significantly worse; none does.</w:t>
       </w:r>
     </w:p>
     <w:p>
@@ -152,7 +152,7 @@
         <w:spacing w:after="80"/>
       </w:pPr>
       <w:r>
-        <w:t xml:space="preserve">Money: the plan adds about $5,637 of ad spend a month and $8,628 of ad-attributed sales. Net profit on a 30-day basis goes from $3,853 to about $210, before any organic gain from better rank. The push is an investment ahead of Q4, when last year's units ran ×1.866 (Nov) and ×2.488 (Dec) of September. The Push-cost tab lists every term so the owner can trim.</w:t>
+        <w:t xml:space="preserve">Money: the plan adds about $5,502 of ad spend a month and $8,137 of ad-attributed sales. Net profit on a 30-day basis goes from $3,853 to about $309, before any organic gain from better rank. The push is an investment ahead of Q4, when last year's units ran ×1.866 (Nov) and ×2.488 (Dec) of September. The Push-cost tab lists every term so the owner can trim.</w:t>
       </w:r>
     </w:p>
     <w:p>
@@ -12335,7 +12335,7 @@
         <w:spacing w:after="120"/>
       </w:pPr>
       <w:r>
-        <w:t xml:space="preserve">Spend and click share. Today: ranking 46% of spend, 30% of clicks. Plan, week 1: 67% of spend ($563 of $835/day) and 49% of clicks. Discovery clicks are cheap, so click share trails spend share. With LTSF clearance and brand defence ring-fenced as their own objectives, ranking is 83% of the remaining keyword spend. Two more −15% steps on the steppable non-ranking campaigns, if their ranks hold, take that to about 84% by week 3. Reaching 80–90% of ALL spend needs non-ranking at $141–63/day. That would cut the LTSF clearance that is selling Queen Grey's aged stock, so it is left for the owner to decide.</w:t>
+        <w:t xml:space="preserve">Spend and click share. Today: ranking 46% of spend, 30% of clicks. Plan, week 1: 68% of spend ($563 of $831/day) and 50% of clicks. Discovery clicks are cheap, so click share trails spend share. With LTSF clearance and brand defence ring-fenced as their own objectives, ranking is 83% of the remaining keyword spend. Two more −15% steps on the steppable non-ranking campaigns, if their ranks hold, take that to about 84% by week 3. Reaching 80–90% of ALL spend needs non-ranking at $141–63/day. That would cut the LTSF clearance that is selling Queen Grey's aged stock, so it is left for the owner to decide.</w:t>
       </w:r>
     </w:p>
     <w:tbl>
@@ -12828,7 +12828,7 @@
                 <w:sz w:val="16"/>
                 <w:szCs w:val="16"/>
               </w:rPr>
-              <w:t xml:space="preserve">$134</w:t>
+              <w:t xml:space="preserve">$129</w:t>
             </w:r>
           </w:p>
         </w:tc>
@@ -12884,7 +12884,7 @@
                 <w:sz w:val="16"/>
                 <w:szCs w:val="16"/>
               </w:rPr>
-              <w:t xml:space="preserve">13.4</w:t>
+              <w:t xml:space="preserve">12.9</w:t>
             </w:r>
           </w:p>
         </w:tc>
@@ -14993,7 +14993,7 @@
         <w:spacing w:after="120"/>
       </w:pPr>
       <w:r>
-        <w:t xml:space="preserve">This applies to every exact campaign, not only ranking. 290 of the 326 enabled exact campaigns go top-of-search only. Ranking campaigns keep today's top-of-search price; other exact campaigns keep today's effective top-of-search bid, less the −15% step where one applies. The only exception is a campaign whose own 90-day data shows top of search converting significantly worse than the other placements (both at least 20 clicks, a 95% test). No campaign meets that exception. 36 enabled exact campaigns have no clicks in 90 days and no bid in any source, so they have nothing to price; set them the same way when they are next edited. Second-order effect: non-ranking exact campaigns lose their rest-of-search and product-page clicks. The plan counts only their top-of-search clicks, at top-of-search conversion, so their orders fall and their conversion rises.</w:t>
+        <w:t xml:space="preserve">This applies to every exact campaign, not only ranking. 288 of the 326 enabled exact campaigns go top-of-search only. Ranking campaigns keep today's top-of-search price; other exact campaigns keep today's effective top-of-search bid, less the −15% step where one applies. The only exception is a campaign whose own 90-day data shows top of search converting significantly worse than the other placements (both at least 20 clicks, a 95% test). No campaign meets that exception. 38 enabled exact campaigns have no clicks in 90 days and no bid in any source, so they have nothing to price; set them the same way when they are next edited. Second-order effect: non-ranking exact campaigns lose their rest-of-search and product-page clicks. The plan counts only their top-of-search clicks, at top-of-search conversion, so their orders fall and their conversion rises.</w:t>
       </w:r>
     </w:p>
     <w:p>
@@ -16306,7 +16306,7 @@
                 <w:sz w:val="16"/>
                 <w:szCs w:val="16"/>
               </w:rPr>
-              <w:t xml:space="preserve">2026-11-26</w:t>
+              <w:t xml:space="preserve">2026-11-27</w:t>
             </w:r>
           </w:p>
         </w:tc>
@@ -16451,7 +16451,7 @@
                 <w:sz w:val="16"/>
                 <w:szCs w:val="16"/>
               </w:rPr>
-              <w:t xml:space="preserve">2026-11-26</w:t>
+              <w:t xml:space="preserve">2026-11-27</w:t>
             </w:r>
           </w:p>
         </w:tc>
@@ -16479,7 +16479,7 @@
                 <w:sz w:val="16"/>
                 <w:szCs w:val="16"/>
               </w:rPr>
-              <w:t xml:space="preserve">2026-12-10</w:t>
+              <w:t xml:space="preserve">2026-12-11</w:t>
             </w:r>
           </w:p>
         </w:tc>
@@ -17187,7 +17187,7 @@
         <w:spacing w:after="120"/>
       </w:pPr>
       <w:r>
-        <w:t xml:space="preserve">Queen: at the plan's pace Queen Black falls under 14 days around 2026-11-14. SATIN-QUEEN-GREY then carries the Queen ranking terms at maintain level until about 2026-11-26, then SATIN-4PCS-QUEEN-STONE-GREY until about 2026-12-10. After that, no Queen child can carry the ranking terms, so the Queen Black reorder has to land by then. Full: Full Black switches to SATIN-FULL-GREY around 2026-10-26, which lasts to about 2026-11-20. King: King Black does not need its back-ups before 31 Jan.</w:t>
+        <w:t xml:space="preserve">Queen: at the plan's pace Queen Black falls under 14 days around 2026-11-14. SATIN-QUEEN-GREY then carries the Queen ranking terms at maintain level until about 2026-11-27, then SATIN-4PCS-QUEEN-STONE-GREY until about 2026-12-11. After that, no Queen child can carry the ranking terms, so the Queen Black reorder has to land by then. Full: Full Black switches to SATIN-FULL-GREY around 2026-10-26, which lasts to about 2026-11-20. King: King Black does not need its back-ups before 31 Jan.</w:t>
       </w:r>
     </w:p>
     <w:p>
@@ -17706,7 +17706,7 @@
                 <w:sz w:val="16"/>
                 <w:szCs w:val="16"/>
               </w:rPr>
-              <w:t xml:space="preserve">$6.82</w:t>
+              <w:t xml:space="preserve">$1.71</w:t>
             </w:r>
           </w:p>
         </w:tc>
@@ -17935,7 +17935,7 @@
                 <w:sz w:val="16"/>
                 <w:szCs w:val="16"/>
               </w:rPr>
-              <w:t xml:space="preserve">$1.6</w:t>
+              <w:t xml:space="preserve">$0.8</w:t>
             </w:r>
           </w:p>
         </w:tc>
@@ -18164,7 +18164,7 @@
                 <w:sz w:val="16"/>
                 <w:szCs w:val="16"/>
               </w:rPr>
-              <w:t xml:space="preserve">$13.54</w:t>
+              <w:t xml:space="preserve">$4.51</w:t>
             </w:r>
           </w:p>
         </w:tc>
@@ -18622,7 +18622,7 @@
                 <w:sz w:val="16"/>
                 <w:szCs w:val="16"/>
               </w:rPr>
-              <w:t xml:space="preserve">$5.02</w:t>
+              <w:t xml:space="preserve">$2.51</w:t>
             </w:r>
           </w:p>
         </w:tc>
@@ -18851,7 +18851,7 @@
                 <w:sz w:val="16"/>
                 <w:szCs w:val="16"/>
               </w:rPr>
-              <w:t xml:space="preserve">$26.57</w:t>
+              <w:t xml:space="preserve">$5.31</w:t>
             </w:r>
           </w:p>
         </w:tc>
@@ -19080,7 +19080,7 @@
                 <w:sz w:val="16"/>
                 <w:szCs w:val="16"/>
               </w:rPr>
-              <w:t xml:space="preserve">$8.1</w:t>
+              <w:t xml:space="preserve">$2.03</w:t>
             </w:r>
           </w:p>
         </w:tc>
@@ -19309,7 +19309,7 @@
                 <w:sz w:val="16"/>
                 <w:szCs w:val="16"/>
               </w:rPr>
-              <w:t xml:space="preserve">$0.0</w:t>
+              <w:t xml:space="preserve">$0.07</w:t>
             </w:r>
           </w:p>
         </w:tc>
@@ -19538,7 +19538,7 @@
                 <w:sz w:val="16"/>
                 <w:szCs w:val="16"/>
               </w:rPr>
-              <w:t xml:space="preserve">$9.13</w:t>
+              <w:t xml:space="preserve">$3.04</w:t>
             </w:r>
           </w:p>
         </w:tc>
@@ -19767,7 +19767,7 @@
                 <w:sz w:val="16"/>
                 <w:szCs w:val="16"/>
               </w:rPr>
-              <w:t xml:space="preserve">$32.06</w:t>
+              <w:t xml:space="preserve">$6.41</w:t>
             </w:r>
           </w:p>
         </w:tc>
@@ -19788,7 +19788,7 @@
         <w:spacing w:after="80"/>
       </w:pPr>
       <w:r>
-        <w:t xml:space="preserve">Queen Grey is the LTSF priority: $448.95 of the charge and about 888 aged units left. Its oldest units were at 331–365 days in July, so they are now past 365 days. Selling one of them avoids about $6.82 of storage and AIS (the sheet's charge per month × months on hand). That is more than its $3.15 profit before ads, so its break-even ACoS for clearance is 34% instead of 11%.</w:t>
+        <w:t xml:space="preserve">Queen Grey is the LTSF priority: $448.95 of the charge and about 888 aged units left. Its oldest units were at 331–365 days in July, so they are now past 365 days. Selling one of them avoids about $1.71 of storage and AIS (the sheet's monthly charge ÷ aged units; that charge already covers the months on hand). Adding it to its $3.15 profit before ads gives a break-even ACoS for clearance of 17% instead of 11%.</w:t>
       </w:r>
     </w:p>
     <w:p>
@@ -19801,7 +19801,7 @@
         <w:spacing w:after="80"/>
       </w:pPr>
       <w:r>
-        <w:t xml:space="preserve">The LTSF campaign ('DECOLURE - SATIN 4 - LTSF Campaign', $788 and 86 orders in 30 days) advertises 45 ASINs but not Queen Grey. Add: SATIN-QUEEN-GREY, SATIN-STRIPE-FULL-GOLD, SATIN-FULL-GREY, SATIN-STONEGREY-TWIN. Pause the 30 product ads that are not on the LTSF sheet or are estimated cleared.</w:t>
+        <w:t xml:space="preserve">The LTSF campaign ('DECOLURE - SATIN 4 - LTSF Campaign', $788 and 86 orders in 30 days) advertises 45 ASINs but not Queen Grey. Add: SATIN-QUEEN-GREY, SATIN-STRIPE-FULL-GOLD, SATIN-FULL-GREY, SATIN-STONEGREY-TWIN. Pause only the 3 product ads that are not on the LTSF sheet and have no sellable stock (they cannot serve); the other ads stay, because per-ad sales are not in the data. The ranking children are not added.</w:t>
       </w:r>
     </w:p>
     <w:p>
@@ -19814,7 +19814,7 @@
         <w:spacing w:after="80"/>
       </w:pPr>
       <w:r>
-        <w:t xml:space="preserve">'DCS-SP-Auto/LTSF-Def-Multi LTSF SKUs': add SATIN-QUEEN-GREY, SATIN-4PCS-QUEEN-STONE-GREY, SATIN-SEA-TEAL-TWIN, SATIN-4PC-FULL-DARK GREEN, SATIN-IVORY-FULL, SATIN-3PC-TWIN-DARK GREEN…; pause SATIN-TWIN-GREY, SATIN-STRIPE-TWIN-PURPLE, SATIN-TAUPE-KING, SATIN-3PC-TWIN-LAVENDER.</w:t>
+        <w:t xml:space="preserve">'DCS-SP-Auto/LTSF-Def-Multi LTSF SKUs': add SATIN-QUEEN-GREY, SATIN-4PCS-QUEEN-STONE-GREY, SATIN-SEA-TEAL-TWIN, SATIN-4PC-FULL-DARK GREEN, SATIN-IVORY-FULL, SATIN-3PC-TWIN-DARK GREEN…; pause SATIN-TAUPE-KING (out-of-stock non-LTSF ads only).</w:t>
       </w:r>
     </w:p>
     <w:p>
@@ -19840,7 +19840,7 @@
         <w:spacing w:after="80"/>
       </w:pPr>
       <w:r>
-        <w:t xml:space="preserve">Under the plan, Queen Grey sells about 10.73 units a day (September equivalent, before the Q4 lift) and clears around 2026-12-05.</w:t>
+        <w:t xml:space="preserve">Under the plan, Queen Grey sells about 10.38 units a day (September equivalent, before the Q4 lift) and clears around 2026-12-06.</w:t>
       </w:r>
     </w:p>
     <w:p>
@@ -21004,7 +21004,7 @@
                 <w:sz w:val="16"/>
                 <w:szCs w:val="16"/>
               </w:rPr>
-              <w:t xml:space="preserve">10.73</w:t>
+              <w:t xml:space="preserve">10.38</w:t>
             </w:r>
           </w:p>
         </w:tc>
@@ -21060,7 +21060,7 @@
                 <w:sz w:val="16"/>
                 <w:szCs w:val="16"/>
               </w:rPr>
-              <w:t xml:space="preserve">2026-12-05</w:t>
+              <w:t xml:space="preserve">2026-12-06</w:t>
             </w:r>
           </w:p>
         </w:tc>
@@ -21088,7 +21088,7 @@
                 <w:sz w:val="16"/>
                 <w:szCs w:val="16"/>
               </w:rPr>
-              <w:t xml:space="preserve">1,224</w:t>
+              <w:t xml:space="preserve">1,146</w:t>
             </w:r>
           </w:p>
         </w:tc>
@@ -21751,7 +21751,7 @@
                 <w:sz w:val="16"/>
                 <w:szCs w:val="16"/>
               </w:rPr>
-              <w:t xml:space="preserve">$120,561</w:t>
+              <w:t xml:space="preserve">$120,070</w:t>
             </w:r>
           </w:p>
         </w:tc>
@@ -21779,7 +21779,7 @@
                 <w:sz w:val="16"/>
                 <w:szCs w:val="16"/>
               </w:rPr>
-              <w:t xml:space="preserve">$27,434</w:t>
+              <w:t xml:space="preserve">$27,299</w:t>
             </w:r>
           </w:p>
         </w:tc>
@@ -21807,7 +21807,7 @@
                 <w:sz w:val="16"/>
                 <w:szCs w:val="16"/>
               </w:rPr>
-              <w:t xml:space="preserve">22.8%</w:t>
+              <w:t xml:space="preserve">22.7%</w:t>
             </w:r>
           </w:p>
         </w:tc>
@@ -21835,7 +21835,7 @@
                 <w:sz w:val="16"/>
                 <w:szCs w:val="16"/>
               </w:rPr>
-              <w:t xml:space="preserve">$210</w:t>
+              <w:t xml:space="preserve">$309</w:t>
             </w:r>
           </w:p>
         </w:tc>
@@ -21863,7 +21863,7 @@
                 <w:sz w:val="16"/>
                 <w:szCs w:val="16"/>
               </w:rPr>
-              <w:t xml:space="preserve">0.2%</w:t>
+              <w:t xml:space="preserve">0.3%</w:t>
             </w:r>
           </w:p>
         </w:tc>
@@ -22443,7 +22443,7 @@
                 <w:sz w:val="16"/>
                 <w:szCs w:val="16"/>
               </w:rPr>
-              <w:t xml:space="preserve">$-1,611</w:t>
+              <w:t xml:space="preserve">$-2,102</w:t>
             </w:r>
           </w:p>
         </w:tc>
@@ -22471,7 +22471,7 @@
                 <w:sz w:val="16"/>
                 <w:szCs w:val="16"/>
               </w:rPr>
-              <w:t xml:space="preserve">$-576</w:t>
+              <w:t xml:space="preserve">$-711</w:t>
             </w:r>
           </w:p>
         </w:tc>
@@ -22527,7 +22527,7 @@
                 <w:sz w:val="16"/>
                 <w:szCs w:val="16"/>
               </w:rPr>
-              <w:t xml:space="preserve">$367</w:t>
+              <w:t xml:space="preserve">$465</w:t>
             </w:r>
           </w:p>
         </w:tc>
@@ -22779,7 +22779,7 @@
         <w:spacing w:after="80"/>
       </w:pPr>
       <w:r>
-        <w:t xml:space="preserve">2. Ranking owners (Campaigns tab, role "Ranking – push/maintain"): move the product ad to the Black child where needed. Then set TOS 900% / ROS 0% / PP 0%, the base bid and the budget shown, and bidding to "down only".</w:t>
+        <w:t xml:space="preserve">2. Ranking owners (Campaigns tab, role "Ranking – push/maintain"): move the product ad to the Black child where needed. Then set TOS 900% / ROS 0% / PP 0%, the base bid and the budget shown. Bidding stays "Dynamic bids – down only" (LEGACY_FOR_SALES in the console is the same setting). Held (maintain) terms keep each term's own top-of-search bid — no raise.</w:t>
       </w:r>
     </w:p>
     <w:p>
@@ -22857,7 +22857,7 @@
         <w:spacing w:after="80"/>
       </w:pPr>
       <w:r>
-        <w:t xml:space="preserve">When Queen Grey is down to about two weeks of stock (the plan clears it around 2026-12-05), switch the campaigns routed to it to Queen Stone Grey, LTSF #2 (~235 aged units left).</w:t>
+        <w:t xml:space="preserve">When Queen Grey is down to about two weeks of stock (the plan clears it around 2026-12-06), switch the campaigns routed to it to Queen Stone Grey, LTSF #2 (~235 aged units left).</w:t>
       </w:r>
     </w:p>
     <w:p>
@@ -22883,7 +22883,7 @@
         <w:spacing w:after="80"/>
       </w:pPr>
       <w:r>
-        <w:t xml:space="preserve">Everything in 2–6 is in the Bulk upload tab, with campaign, ad group and keyword IDs where Sellerboard provides them.</w:t>
+        <w:t xml:space="preserve">Everything in 2–6 is in the action plan (DSS4_Action_Plan): the Action list, the Keyword changes tab (negatives, harvests, LTSF exacts) and the Bulk upload tab (rows with every ID they need, SKU included; the rest are in "Needs console IDs"). This week (Lightning Deal 30 Sep, Prime Big Deal Days 7 Oct): upload step 2 only.</w:t>
       </w:r>
     </w:p>
     <w:p>

</xml_diff>